<commit_message>
Add the first prompt: Claude makes the student's private copy from the template
Setup now leads with a copy-paste prompt (docs/first-prompt.md) that creates a
private repo from this template, clones it, sets git identity and proves each
step. Word guide updated with the prompt on its own page and a prompts appendix.

Co-Authored-By: Claude Opus 5.5 (1M context) <noreply@anthropic.com>
</commit_message>
<xml_diff>
--- a/docs/Claude-Code-Beginners-Guide.docx
+++ b/docs/Claude-Code-Beginners-Guide.docx
@@ -54,7 +54,7 @@
         <w:spacing w:after="120" w:line="300" w:lineRule="auto"/>
       </w:pPr>
       <w:r>
-        <w:t xml:space="preserve">This guide goes with your </w:t>
+        <w:t xml:space="preserve">This guide goes with the </w:t>
       </w:r>
       <w:r>
         <w:rPr>
@@ -65,6 +65,21 @@
       </w:r>
       <w:r>
         <w:t xml:space="preserve"> repo. The repo is the system; this document explains how to drive it. Read Parts 1 to 3 before you start, then keep the rest as a reference.</w:t>
+      </w:r>
+    </w:p>
+    <w:p>
+      <w:pPr>
+        <w:spacing w:after="120" w:line="300" w:lineRule="auto"/>
+      </w:pPr>
+      <w:r>
+        <w:rPr>
+          <w:b/>
+          <w:bCs/>
+        </w:rPr>
+        <w:t>Starting from zero?</w:t>
+      </w:r>
+      <w:r>
+        <w:t xml:space="preserve"> Go to Part 2: install Claude Code, then paste the first prompt it gives you. Claude sets up your own private copy for you.</w:t>
       </w:r>
     </w:p>
     <w:p>
@@ -93,7 +108,7 @@
     <w:sdt>
       <w:sdtPr>
         <w:alias w:val="Contents"/>
-        <w:id w:val="131536968"/>
+        <w:id w:val="-1352644589"/>
       </w:sdtPr>
       <w:sdtEndPr/>
       <w:sdtContent>
@@ -122,7 +137,7 @@
           <w:r>
             <w:fldChar w:fldCharType="separate"/>
           </w:r>
-          <w:hyperlink w:anchor="_Toc241667781" w:history="1">
+          <w:hyperlink w:anchor="_Toc241675034" w:history="1">
             <w:r>
               <w:rPr>
                 <w:rStyle w:val="Hyperlink"/>
@@ -146,7 +161,7 @@
               <w:rPr>
                 <w:noProof/>
               </w:rPr>
-              <w:instrText xml:space="preserve"> PAGEREF _Toc241667781 \h </w:instrText>
+              <w:instrText xml:space="preserve"> PAGEREF _Toc241675034 \h </w:instrText>
             </w:r>
             <w:r>
               <w:rPr>
@@ -189,7 +204,7 @@
               <w14:ligatures w14:val="standardContextual"/>
             </w:rPr>
           </w:pPr>
-          <w:hyperlink w:anchor="_Toc241667782" w:history="1">
+          <w:hyperlink w:anchor="_Toc241675035" w:history="1">
             <w:r>
               <w:rPr>
                 <w:rStyle w:val="Hyperlink"/>
@@ -213,7 +228,7 @@
               <w:rPr>
                 <w:noProof/>
               </w:rPr>
-              <w:instrText xml:space="preserve"> PAGEREF _Toc241667782 \h </w:instrText>
+              <w:instrText xml:space="preserve"> PAGEREF _Toc241675035 \h </w:instrText>
             </w:r>
             <w:r>
               <w:rPr>
@@ -256,7 +271,7 @@
               <w14:ligatures w14:val="standardContextual"/>
             </w:rPr>
           </w:pPr>
-          <w:hyperlink w:anchor="_Toc241667783" w:history="1">
+          <w:hyperlink w:anchor="_Toc241675036" w:history="1">
             <w:r>
               <w:rPr>
                 <w:rStyle w:val="Hyperlink"/>
@@ -280,7 +295,7 @@
               <w:rPr>
                 <w:noProof/>
               </w:rPr>
-              <w:instrText xml:space="preserve"> PAGEREF _Toc241667783 \h </w:instrText>
+              <w:instrText xml:space="preserve"> PAGEREF _Toc241675036 \h </w:instrText>
             </w:r>
             <w:r>
               <w:rPr>
@@ -297,7 +312,7 @@
               <w:rPr>
                 <w:noProof/>
               </w:rPr>
-              <w:t>5</w:t>
+              <w:t>7</w:t>
             </w:r>
             <w:r>
               <w:rPr>
@@ -323,7 +338,7 @@
               <w14:ligatures w14:val="standardContextual"/>
             </w:rPr>
           </w:pPr>
-          <w:hyperlink w:anchor="_Toc241667784" w:history="1">
+          <w:hyperlink w:anchor="_Toc241675037" w:history="1">
             <w:r>
               <w:rPr>
                 <w:rStyle w:val="Hyperlink"/>
@@ -347,7 +362,7 @@
               <w:rPr>
                 <w:noProof/>
               </w:rPr>
-              <w:instrText xml:space="preserve"> PAGEREF _Toc241667784 \h </w:instrText>
+              <w:instrText xml:space="preserve"> PAGEREF _Toc241675037 \h </w:instrText>
             </w:r>
             <w:r>
               <w:rPr>
@@ -364,7 +379,7 @@
               <w:rPr>
                 <w:noProof/>
               </w:rPr>
-              <w:t>8</w:t>
+              <w:t>10</w:t>
             </w:r>
             <w:r>
               <w:rPr>
@@ -390,7 +405,7 @@
               <w14:ligatures w14:val="standardContextual"/>
             </w:rPr>
           </w:pPr>
-          <w:hyperlink w:anchor="_Toc241667785" w:history="1">
+          <w:hyperlink w:anchor="_Toc241675038" w:history="1">
             <w:r>
               <w:rPr>
                 <w:rStyle w:val="Hyperlink"/>
@@ -414,7 +429,7 @@
               <w:rPr>
                 <w:noProof/>
               </w:rPr>
-              <w:instrText xml:space="preserve"> PAGEREF _Toc241667785 \h </w:instrText>
+              <w:instrText xml:space="preserve"> PAGEREF _Toc241675038 \h </w:instrText>
             </w:r>
             <w:r>
               <w:rPr>
@@ -431,7 +446,7 @@
               <w:rPr>
                 <w:noProof/>
               </w:rPr>
-              <w:t>10</w:t>
+              <w:t>12</w:t>
             </w:r>
             <w:r>
               <w:rPr>
@@ -457,7 +472,7 @@
               <w14:ligatures w14:val="standardContextual"/>
             </w:rPr>
           </w:pPr>
-          <w:hyperlink w:anchor="_Toc241667786" w:history="1">
+          <w:hyperlink w:anchor="_Toc241675039" w:history="1">
             <w:r>
               <w:rPr>
                 <w:rStyle w:val="Hyperlink"/>
@@ -481,7 +496,7 @@
               <w:rPr>
                 <w:noProof/>
               </w:rPr>
-              <w:instrText xml:space="preserve"> PAGEREF _Toc241667786 \h </w:instrText>
+              <w:instrText xml:space="preserve"> PAGEREF _Toc241675039 \h </w:instrText>
             </w:r>
             <w:r>
               <w:rPr>
@@ -498,7 +513,7 @@
               <w:rPr>
                 <w:noProof/>
               </w:rPr>
-              <w:t>12</w:t>
+              <w:t>14</w:t>
             </w:r>
             <w:r>
               <w:rPr>
@@ -524,7 +539,7 @@
               <w14:ligatures w14:val="standardContextual"/>
             </w:rPr>
           </w:pPr>
-          <w:hyperlink w:anchor="_Toc241667787" w:history="1">
+          <w:hyperlink w:anchor="_Toc241675040" w:history="1">
             <w:r>
               <w:rPr>
                 <w:rStyle w:val="Hyperlink"/>
@@ -548,7 +563,7 @@
               <w:rPr>
                 <w:noProof/>
               </w:rPr>
-              <w:instrText xml:space="preserve"> PAGEREF _Toc241667787 \h </w:instrText>
+              <w:instrText xml:space="preserve"> PAGEREF _Toc241675040 \h </w:instrText>
             </w:r>
             <w:r>
               <w:rPr>
@@ -565,7 +580,7 @@
               <w:rPr>
                 <w:noProof/>
               </w:rPr>
-              <w:t>14</w:t>
+              <w:t>16</w:t>
             </w:r>
             <w:r>
               <w:rPr>
@@ -591,7 +606,7 @@
               <w14:ligatures w14:val="standardContextual"/>
             </w:rPr>
           </w:pPr>
-          <w:hyperlink w:anchor="_Toc241667788" w:history="1">
+          <w:hyperlink w:anchor="_Toc241675041" w:history="1">
             <w:r>
               <w:rPr>
                 <w:rStyle w:val="Hyperlink"/>
@@ -615,7 +630,7 @@
               <w:rPr>
                 <w:noProof/>
               </w:rPr>
-              <w:instrText xml:space="preserve"> PAGEREF _Toc241667788 \h </w:instrText>
+              <w:instrText xml:space="preserve"> PAGEREF _Toc241675041 \h </w:instrText>
             </w:r>
             <w:r>
               <w:rPr>
@@ -632,7 +647,7 @@
               <w:rPr>
                 <w:noProof/>
               </w:rPr>
-              <w:t>17</w:t>
+              <w:t>18</w:t>
             </w:r>
             <w:r>
               <w:rPr>
@@ -658,7 +673,7 @@
               <w14:ligatures w14:val="standardContextual"/>
             </w:rPr>
           </w:pPr>
-          <w:hyperlink w:anchor="_Toc241667789" w:history="1">
+          <w:hyperlink w:anchor="_Toc241675042" w:history="1">
             <w:r>
               <w:rPr>
                 <w:rStyle w:val="Hyperlink"/>
@@ -682,7 +697,7 @@
               <w:rPr>
                 <w:noProof/>
               </w:rPr>
-              <w:instrText xml:space="preserve"> PAGEREF _Toc241667789 \h </w:instrText>
+              <w:instrText xml:space="preserve"> PAGEREF _Toc241675042 \h </w:instrText>
             </w:r>
             <w:r>
               <w:rPr>
@@ -699,7 +714,7 @@
               <w:rPr>
                 <w:noProof/>
               </w:rPr>
-              <w:t>18</w:t>
+              <w:t>19</w:t>
             </w:r>
             <w:r>
               <w:rPr>
@@ -725,7 +740,7 @@
               <w14:ligatures w14:val="standardContextual"/>
             </w:rPr>
           </w:pPr>
-          <w:hyperlink w:anchor="_Toc241667790" w:history="1">
+          <w:hyperlink w:anchor="_Toc241675043" w:history="1">
             <w:r>
               <w:rPr>
                 <w:rStyle w:val="Hyperlink"/>
@@ -749,7 +764,7 @@
               <w:rPr>
                 <w:noProof/>
               </w:rPr>
-              <w:instrText xml:space="preserve"> PAGEREF _Toc241667790 \h </w:instrText>
+              <w:instrText xml:space="preserve"> PAGEREF _Toc241675043 \h </w:instrText>
             </w:r>
             <w:r>
               <w:rPr>
@@ -766,7 +781,7 @@
               <w:rPr>
                 <w:noProof/>
               </w:rPr>
-              <w:t>20</w:t>
+              <w:t>21</w:t>
             </w:r>
             <w:r>
               <w:rPr>
@@ -792,7 +807,7 @@
               <w14:ligatures w14:val="standardContextual"/>
             </w:rPr>
           </w:pPr>
-          <w:hyperlink w:anchor="_Toc241667791" w:history="1">
+          <w:hyperlink w:anchor="_Toc241675044" w:history="1">
             <w:r>
               <w:rPr>
                 <w:rStyle w:val="Hyperlink"/>
@@ -816,7 +831,7 @@
               <w:rPr>
                 <w:noProof/>
               </w:rPr>
-              <w:instrText xml:space="preserve"> PAGEREF _Toc241667791 \h </w:instrText>
+              <w:instrText xml:space="preserve"> PAGEREF _Toc241675044 \h </w:instrText>
             </w:r>
             <w:r>
               <w:rPr>
@@ -833,7 +848,7 @@
               <w:rPr>
                 <w:noProof/>
               </w:rPr>
-              <w:t>22</w:t>
+              <w:t>23</w:t>
             </w:r>
             <w:r>
               <w:rPr>
@@ -859,7 +874,7 @@
               <w14:ligatures w14:val="standardContextual"/>
             </w:rPr>
           </w:pPr>
-          <w:hyperlink w:anchor="_Toc241667792" w:history="1">
+          <w:hyperlink w:anchor="_Toc241675045" w:history="1">
             <w:r>
               <w:rPr>
                 <w:rStyle w:val="Hyperlink"/>
@@ -883,7 +898,7 @@
               <w:rPr>
                 <w:noProof/>
               </w:rPr>
-              <w:instrText xml:space="preserve"> PAGEREF _Toc241667792 \h </w:instrText>
+              <w:instrText xml:space="preserve"> PAGEREF _Toc241675045 \h </w:instrText>
             </w:r>
             <w:r>
               <w:rPr>
@@ -900,7 +915,7 @@
               <w:rPr>
                 <w:noProof/>
               </w:rPr>
-              <w:t>24</w:t>
+              <w:t>25</w:t>
             </w:r>
             <w:r>
               <w:rPr>
@@ -926,7 +941,7 @@
               <w14:ligatures w14:val="standardContextual"/>
             </w:rPr>
           </w:pPr>
-          <w:hyperlink w:anchor="_Toc241667793" w:history="1">
+          <w:hyperlink w:anchor="_Toc241675046" w:history="1">
             <w:r>
               <w:rPr>
                 <w:rStyle w:val="Hyperlink"/>
@@ -950,7 +965,7 @@
               <w:rPr>
                 <w:noProof/>
               </w:rPr>
-              <w:instrText xml:space="preserve"> PAGEREF _Toc241667793 \h </w:instrText>
+              <w:instrText xml:space="preserve"> PAGEREF _Toc241675046 \h </w:instrText>
             </w:r>
             <w:r>
               <w:rPr>
@@ -967,7 +982,7 @@
               <w:rPr>
                 <w:noProof/>
               </w:rPr>
-              <w:t>25</w:t>
+              <w:t>26</w:t>
             </w:r>
             <w:r>
               <w:rPr>
@@ -993,7 +1008,7 @@
               <w14:ligatures w14:val="standardContextual"/>
             </w:rPr>
           </w:pPr>
-          <w:hyperlink w:anchor="_Toc241667794" w:history="1">
+          <w:hyperlink w:anchor="_Toc241675047" w:history="1">
             <w:r>
               <w:rPr>
                 <w:rStyle w:val="Hyperlink"/>
@@ -1017,7 +1032,7 @@
               <w:rPr>
                 <w:noProof/>
               </w:rPr>
-              <w:instrText xml:space="preserve"> PAGEREF _Toc241667794 \h </w:instrText>
+              <w:instrText xml:space="preserve"> PAGEREF _Toc241675047 \h </w:instrText>
             </w:r>
             <w:r>
               <w:rPr>
@@ -1034,7 +1049,7 @@
               <w:rPr>
                 <w:noProof/>
               </w:rPr>
-              <w:t>26</w:t>
+              <w:t>27</w:t>
             </w:r>
             <w:r>
               <w:rPr>
@@ -1060,7 +1075,7 @@
               <w14:ligatures w14:val="standardContextual"/>
             </w:rPr>
           </w:pPr>
-          <w:hyperlink w:anchor="_Toc241667795" w:history="1">
+          <w:hyperlink w:anchor="_Toc241675048" w:history="1">
             <w:r>
               <w:rPr>
                 <w:rStyle w:val="Hyperlink"/>
@@ -1084,7 +1099,7 @@
               <w:rPr>
                 <w:noProof/>
               </w:rPr>
-              <w:instrText xml:space="preserve"> PAGEREF _Toc241667795 \h </w:instrText>
+              <w:instrText xml:space="preserve"> PAGEREF _Toc241675048 \h </w:instrText>
             </w:r>
             <w:r>
               <w:rPr>
@@ -1101,7 +1116,74 @@
               <w:rPr>
                 <w:noProof/>
               </w:rPr>
-              <w:t>28</w:t>
+              <w:t>29</w:t>
+            </w:r>
+            <w:r>
+              <w:rPr>
+                <w:noProof/>
+              </w:rPr>
+              <w:fldChar w:fldCharType="end"/>
+            </w:r>
+          </w:hyperlink>
+        </w:p>
+        <w:p>
+          <w:pPr>
+            <w:pStyle w:val="TOC1"/>
+            <w:tabs>
+              <w:tab w:val="right" w:leader="dot" w:pos="9016"/>
+            </w:tabs>
+            <w:rPr>
+              <w:rFonts w:asciiTheme="minorHAnsi" w:eastAsiaTheme="minorEastAsia" w:hAnsiTheme="minorHAnsi" w:cstheme="minorBidi"/>
+              <w:noProof/>
+              <w:color w:val="auto"/>
+              <w:kern w:val="2"/>
+              <w:sz w:val="24"/>
+              <w:szCs w:val="24"/>
+              <w14:ligatures w14:val="standardContextual"/>
+            </w:rPr>
+          </w:pPr>
+          <w:hyperlink w:anchor="_Toc241675049" w:history="1">
+            <w:r>
+              <w:rPr>
+                <w:rStyle w:val="Hyperlink"/>
+                <w:noProof/>
+              </w:rPr>
+              <w:t>Appendix: copy-paste prompts</w:t>
+            </w:r>
+            <w:r>
+              <w:rPr>
+                <w:noProof/>
+              </w:rPr>
+              <w:tab/>
+            </w:r>
+            <w:r>
+              <w:rPr>
+                <w:noProof/>
+              </w:rPr>
+              <w:fldChar w:fldCharType="begin"/>
+            </w:r>
+            <w:r>
+              <w:rPr>
+                <w:noProof/>
+              </w:rPr>
+              <w:instrText xml:space="preserve"> PAGEREF _Toc241675049 \h </w:instrText>
+            </w:r>
+            <w:r>
+              <w:rPr>
+                <w:noProof/>
+              </w:rPr>
+            </w:r>
+            <w:r>
+              <w:rPr>
+                <w:noProof/>
+              </w:rPr>
+              <w:fldChar w:fldCharType="separate"/>
+            </w:r>
+            <w:r>
+              <w:rPr>
+                <w:noProof/>
+              </w:rPr>
+              <w:t>30</w:t>
             </w:r>
             <w:r>
               <w:rPr>
@@ -1123,7 +1205,7 @@
         <w:pStyle w:val="Heading1"/>
         <w:pageBreakBefore/>
       </w:pPr>
-      <w:bookmarkStart w:id="0" w:name="_Toc241667781"/>
+      <w:bookmarkStart w:id="0" w:name="_Toc241675034"/>
       <w:r>
         <w:lastRenderedPageBreak/>
         <w:t>1. What Claude Code actually is</w:t>
@@ -2387,7 +2469,7 @@
         <w:pStyle w:val="Heading1"/>
         <w:pageBreakBefore/>
       </w:pPr>
-      <w:bookmarkStart w:id="1" w:name="_Toc241667782"/>
+      <w:bookmarkStart w:id="1" w:name="_Toc241675035"/>
       <w:r>
         <w:lastRenderedPageBreak/>
         <w:t>2. Getting set up</w:t>
@@ -2399,7 +2481,7 @@
         <w:spacing w:after="120" w:line="300" w:lineRule="auto"/>
       </w:pPr>
       <w:r>
-        <w:t>Do this once. It takes about 30 to 45 minutes. The README in your repo has the same steps with copy-paste commands.</w:t>
+        <w:t>Do this once. It takes about 30 to 45 minutes, and Claude does most of it for you. The README in your repo has the same steps.</w:t>
       </w:r>
     </w:p>
     <w:p>
@@ -2476,7 +2558,7 @@
         <w:t>Git for Windows</w:t>
       </w:r>
       <w:r>
-        <w:t>.</w:t>
+        <w:t xml:space="preserve"> (git-scm.com).</w:t>
       </w:r>
     </w:p>
     <w:p>
@@ -2501,60 +2583,34 @@
           <w:b/>
           <w:bCs/>
         </w:rPr>
-        <w:t>Make your own private copy of the repo.</w:t>
-      </w:r>
-      <w:r>
-        <w:t xml:space="preserve"> On the Starter OS GitHub page click </w:t>
+        <w:t>Install Claude Code.</w:t>
+      </w:r>
+      <w:r>
+        <w:t xml:space="preserve"> Open a terminal (Mac: Cmd+Space, type Terminal. Windows: PowerShell) and paste: Mac/Linux </w:t>
       </w:r>
       <w:r>
         <w:rPr>
-          <w:b/>
-          <w:bCs/>
+          <w:rFonts w:ascii="Consolas" w:eastAsia="Consolas" w:hAnsi="Consolas" w:cs="Consolas"/>
+          <w:color w:val="7C2D12"/>
+          <w:sz w:val="19"/>
+          <w:szCs w:val="19"/>
         </w:rPr>
-        <w:t>Use this template</w:t>
-      </w:r>
-      <w:r>
-        <w:t xml:space="preserve">, then </w:t>
+        <w:t>curl -fsSL https://claude.ai/install.sh | bash</w:t>
+      </w:r>
+      <w:r>
+        <w:t xml:space="preserve">, Windows </w:t>
       </w:r>
       <w:r>
         <w:rPr>
-          <w:b/>
-          <w:bCs/>
+          <w:rFonts w:ascii="Consolas" w:eastAsia="Consolas" w:hAnsi="Consolas" w:cs="Consolas"/>
+          <w:color w:val="7C2D12"/>
+          <w:sz w:val="19"/>
+          <w:szCs w:val="19"/>
         </w:rPr>
-        <w:t>Create a new repository</w:t>
-      </w:r>
-      <w:r>
-        <w:t xml:space="preserve">, name it (e.g. my-ai-os) and choose </w:t>
-      </w:r>
-      <w:r>
-        <w:rPr>
-          <w:b/>
-          <w:bCs/>
-        </w:rPr>
-        <w:t>Private</w:t>
-      </w:r>
-      <w:r>
-        <w:t>. Your copy will hold personal information, so private matters.</w:t>
-      </w:r>
-    </w:p>
-    <w:p>
-      <w:pPr>
-        <w:pStyle w:val="ListParagraph"/>
-        <w:numPr>
-          <w:ilvl w:val="0"/>
-          <w:numId w:val="3"/>
-        </w:numPr>
-        <w:spacing w:after="80" w:line="290" w:lineRule="auto"/>
-      </w:pPr>
-      <w:r>
-        <w:rPr>
-          <w:b/>
-          <w:bCs/>
-        </w:rPr>
-        <w:t>Install Claude Code.</w:t>
-      </w:r>
-      <w:r>
-        <w:t xml:space="preserve"> Open a terminal (Mac: Cmd+Space, type Terminal. Windows: PowerShell) and paste the install command from the README. Close and reopen the terminal, then run </w:t>
+        <w:t>irm https://claude.ai/install.ps1 | iex</w:t>
+      </w:r>
+      <w:r>
+        <w:t xml:space="preserve">. Close and reopen the terminal, then run </w:t>
       </w:r>
       <w:r>
         <w:rPr>
@@ -2630,7 +2686,7 @@
         <w:t>Install Orca</w:t>
       </w:r>
       <w:r>
-        <w:t xml:space="preserve"> (the app you will run Claude in). See Part 8.</w:t>
+        <w:t xml:space="preserve"> (optional, the app you will run Claude in). See Part 8. You can do everything in a plain terminal too.</w:t>
       </w:r>
     </w:p>
     <w:p>
@@ -2647,10 +2703,735 @@
           <w:b/>
           <w:bCs/>
         </w:rPr>
-        <w:t>Log in to GitHub and introduce yourself to git.</w:t>
-      </w:r>
-      <w:r>
-        <w:t xml:space="preserve"> Install the GitHub CLI (cli.github.com), run </w:t>
+        <w:t>Open Claude in your home folder.</w:t>
+      </w:r>
+      <w:r>
+        <w:t xml:space="preserve"> In the terminal: </w:t>
+      </w:r>
+      <w:r>
+        <w:rPr>
+          <w:rFonts w:ascii="Consolas" w:eastAsia="Consolas" w:hAnsi="Consolas" w:cs="Consolas"/>
+          <w:color w:val="7C2D12"/>
+          <w:sz w:val="19"/>
+          <w:szCs w:val="19"/>
+        </w:rPr>
+        <w:t>cd ~</w:t>
+      </w:r>
+      <w:r>
+        <w:t xml:space="preserve"> then </w:t>
+      </w:r>
+      <w:r>
+        <w:rPr>
+          <w:rFonts w:ascii="Consolas" w:eastAsia="Consolas" w:hAnsi="Consolas" w:cs="Consolas"/>
+          <w:color w:val="7C2D12"/>
+          <w:sz w:val="19"/>
+          <w:szCs w:val="19"/>
+        </w:rPr>
+        <w:t>claude</w:t>
+      </w:r>
+      <w:r>
+        <w:t>. (Or start an agent in Orca in your home folder.)</w:t>
+      </w:r>
+    </w:p>
+    <w:p>
+      <w:pPr>
+        <w:pStyle w:val="ListParagraph"/>
+        <w:numPr>
+          <w:ilvl w:val="0"/>
+          <w:numId w:val="3"/>
+        </w:numPr>
+        <w:spacing w:after="80" w:line="290" w:lineRule="auto"/>
+      </w:pPr>
+      <w:r>
+        <w:rPr>
+          <w:b/>
+          <w:bCs/>
+        </w:rPr>
+        <w:t>Paste the first prompt</w:t>
+      </w:r>
+      <w:r>
+        <w:t xml:space="preserve"> (next section). Claude gets you logged in to GitHub, creates your own </w:t>
+      </w:r>
+      <w:r>
+        <w:rPr>
+          <w:b/>
+          <w:bCs/>
+        </w:rPr>
+        <w:t>private</w:t>
+      </w:r>
+      <w:r>
+        <w:t xml:space="preserve"> copy of the Starter OS, downloads it, sets up git, and proves each step worked.</w:t>
+      </w:r>
+    </w:p>
+    <w:p>
+      <w:pPr>
+        <w:pStyle w:val="ListParagraph"/>
+        <w:numPr>
+          <w:ilvl w:val="0"/>
+          <w:numId w:val="3"/>
+        </w:numPr>
+        <w:spacing w:after="80" w:line="290" w:lineRule="auto"/>
+      </w:pPr>
+      <w:r>
+        <w:rPr>
+          <w:b/>
+          <w:bCs/>
+        </w:rPr>
+        <w:t>Restart Claude inside your copy.</w:t>
+      </w:r>
+      <w:r>
+        <w:t xml:space="preserve"> Type </w:t>
+      </w:r>
+      <w:r>
+        <w:rPr>
+          <w:rFonts w:ascii="Consolas" w:eastAsia="Consolas" w:hAnsi="Consolas" w:cs="Consolas"/>
+          <w:color w:val="7C2D12"/>
+          <w:sz w:val="19"/>
+          <w:szCs w:val="19"/>
+        </w:rPr>
+        <w:t>/exit</w:t>
+      </w:r>
+      <w:r>
+        <w:t xml:space="preserve">, then </w:t>
+      </w:r>
+      <w:r>
+        <w:rPr>
+          <w:rFonts w:ascii="Consolas" w:eastAsia="Consolas" w:hAnsi="Consolas" w:cs="Consolas"/>
+          <w:color w:val="7C2D12"/>
+          <w:sz w:val="19"/>
+          <w:szCs w:val="19"/>
+        </w:rPr>
+        <w:t>cd ~/my-ai-os</w:t>
+      </w:r>
+      <w:r>
+        <w:t xml:space="preserve"> and </w:t>
+      </w:r>
+      <w:r>
+        <w:rPr>
+          <w:rFonts w:ascii="Consolas" w:eastAsia="Consolas" w:hAnsi="Consolas" w:cs="Consolas"/>
+          <w:color w:val="7C2D12"/>
+          <w:sz w:val="19"/>
+          <w:szCs w:val="19"/>
+        </w:rPr>
+        <w:t>claude</w:t>
+      </w:r>
+      <w:r>
+        <w:t>. Your skills only load when Claude starts inside that folder. When it asks if you trust the folder, say yes.</w:t>
+      </w:r>
+    </w:p>
+    <w:p>
+      <w:pPr>
+        <w:pStyle w:val="ListParagraph"/>
+        <w:numPr>
+          <w:ilvl w:val="0"/>
+          <w:numId w:val="3"/>
+        </w:numPr>
+        <w:spacing w:after="80" w:line="290" w:lineRule="auto"/>
+      </w:pPr>
+      <w:r>
+        <w:rPr>
+          <w:b/>
+          <w:bCs/>
+        </w:rPr>
+        <w:t>Say "set me up".</w:t>
+      </w:r>
+      <w:r>
+        <w:t xml:space="preserve"> Claude interviews you (about ten questions) and fills in who you are, your units, deadlines and goals.</w:t>
+      </w:r>
+    </w:p>
+    <w:p>
+      <w:pPr>
+        <w:pStyle w:val="ListParagraph"/>
+        <w:numPr>
+          <w:ilvl w:val="0"/>
+          <w:numId w:val="3"/>
+        </w:numPr>
+        <w:spacing w:after="80" w:line="290" w:lineRule="auto"/>
+      </w:pPr>
+      <w:r>
+        <w:rPr>
+          <w:b/>
+          <w:bCs/>
+        </w:rPr>
+        <w:t>Say "set up g-brain".</w:t>
+      </w:r>
+      <w:r>
+        <w:t xml:space="preserve"> Claude installs and connects your long-term memory (Part 7).</w:t>
+      </w:r>
+    </w:p>
+    <w:p>
+      <w:pPr>
+        <w:pStyle w:val="ListParagraph"/>
+        <w:numPr>
+          <w:ilvl w:val="0"/>
+          <w:numId w:val="3"/>
+        </w:numPr>
+        <w:spacing w:after="80" w:line="290" w:lineRule="auto"/>
+      </w:pPr>
+      <w:r>
+        <w:rPr>
+          <w:b/>
+          <w:bCs/>
+        </w:rPr>
+        <w:t>Run the checker</w:t>
+      </w:r>
+      <w:r>
+        <w:t xml:space="preserve">: </w:t>
+      </w:r>
+      <w:r>
+        <w:rPr>
+          <w:rFonts w:ascii="Consolas" w:eastAsia="Consolas" w:hAnsi="Consolas" w:cs="Consolas"/>
+          <w:color w:val="7C2D12"/>
+          <w:sz w:val="19"/>
+          <w:szCs w:val="19"/>
+        </w:rPr>
+        <w:t>bash scripts/check-setup.sh</w:t>
+      </w:r>
+      <w:r>
+        <w:t xml:space="preserve">. Everything should say [ok]. On Windows, run it in </w:t>
+      </w:r>
+      <w:r>
+        <w:rPr>
+          <w:b/>
+          <w:bCs/>
+        </w:rPr>
+        <w:t>Git Bash</w:t>
+      </w:r>
+      <w:r>
+        <w:t xml:space="preserve"> (it came with Git for Windows), not PowerShell.</w:t>
+      </w:r>
+    </w:p>
+    <w:p>
+      <w:pPr>
+        <w:pStyle w:val="Heading2"/>
+        <w:pageBreakBefore/>
+      </w:pPr>
+      <w:r>
+        <w:lastRenderedPageBreak/>
+        <w:t>Your first prompt: make your private copy</w:t>
+      </w:r>
+    </w:p>
+    <w:p>
+      <w:pPr>
+        <w:spacing w:after="120" w:line="300" w:lineRule="auto"/>
+      </w:pPr>
+      <w:r>
+        <w:t xml:space="preserve">Copy everything in the box below and paste it into Claude as your very first message (step 5). Your copy will hold personal details, which is why it has to be </w:t>
+      </w:r>
+      <w:r>
+        <w:rPr>
+          <w:b/>
+          <w:bCs/>
+        </w:rPr>
+        <w:t>private</w:t>
+      </w:r>
+      <w:r>
+        <w:t>; this prompt makes sure it is, and never touches the shared template.</w:t>
+      </w:r>
+    </w:p>
+    <w:p>
+      <w:pPr>
+        <w:pBdr>
+          <w:top w:val="single" w:sz="12" w:space="4" w:color="4F46E5"/>
+          <w:left w:val="single" w:sz="12" w:space="4" w:color="4F46E5"/>
+          <w:right w:val="single" w:sz="12" w:space="4" w:color="4F46E5"/>
+        </w:pBdr>
+        <w:shd w:val="clear" w:color="auto" w:fill="F5F3FF"/>
+        <w:spacing w:before="120" w:after="60" w:line="250" w:lineRule="auto"/>
+        <w:ind w:left="120" w:right="120"/>
+      </w:pPr>
+      <w:r>
+        <w:rPr>
+          <w:rFonts w:ascii="Consolas" w:eastAsia="Consolas" w:hAnsi="Consolas" w:cs="Consolas"/>
+          <w:sz w:val="17"/>
+          <w:szCs w:val="17"/>
+        </w:rPr>
+        <w:t>I'm new to Claude Code. Please set up my own private copy of an AI operating system template, explaining each step in one plain sentence as you go.</w:t>
+      </w:r>
+    </w:p>
+    <w:p>
+      <w:pPr>
+        <w:pBdr>
+          <w:left w:val="single" w:sz="12" w:space="4" w:color="4F46E5"/>
+          <w:right w:val="single" w:sz="12" w:space="4" w:color="4F46E5"/>
+        </w:pBdr>
+        <w:shd w:val="clear" w:color="auto" w:fill="F5F3FF"/>
+        <w:spacing w:after="60" w:line="250" w:lineRule="auto"/>
+        <w:ind w:left="120" w:right="120"/>
+      </w:pPr>
+      <w:r>
+        <w:rPr>
+          <w:rFonts w:ascii="Consolas" w:eastAsia="Consolas" w:hAnsi="Consolas" w:cs="Consolas"/>
+          <w:sz w:val="17"/>
+          <w:szCs w:val="17"/>
+        </w:rPr>
+        <w:t>GOAL: a PRIVATE GitHub repo in my account, created from the template jacksnell2804-bro/claude-code-starter-os, downloaded to my home folder and ready to use.</w:t>
+      </w:r>
+    </w:p>
+    <w:p>
+      <w:pPr>
+        <w:pBdr>
+          <w:left w:val="single" w:sz="12" w:space="4" w:color="4F46E5"/>
+          <w:right w:val="single" w:sz="12" w:space="4" w:color="4F46E5"/>
+        </w:pBdr>
+        <w:shd w:val="clear" w:color="auto" w:fill="F5F3FF"/>
+        <w:spacing w:after="60" w:line="250" w:lineRule="auto"/>
+        <w:ind w:left="120" w:right="120"/>
+      </w:pPr>
+      <w:r>
+        <w:rPr>
+          <w:rFonts w:ascii="Consolas" w:eastAsia="Consolas" w:hAnsi="Consolas" w:cs="Consolas"/>
+          <w:sz w:val="17"/>
+          <w:szCs w:val="17"/>
+        </w:rPr>
+        <w:t>DONE MEANS all of these are true, and you show me the proof for each:</w:t>
+      </w:r>
+    </w:p>
+    <w:p>
+      <w:pPr>
+        <w:pBdr>
+          <w:left w:val="single" w:sz="12" w:space="4" w:color="4F46E5"/>
+          <w:right w:val="single" w:sz="12" w:space="4" w:color="4F46E5"/>
+        </w:pBdr>
+        <w:shd w:val="clear" w:color="auto" w:fill="F5F3FF"/>
+        <w:spacing w:after="60" w:line="250" w:lineRule="auto"/>
+        <w:ind w:left="120" w:right="120"/>
+      </w:pPr>
+      <w:r>
+        <w:rPr>
+          <w:rFonts w:ascii="Consolas" w:eastAsia="Consolas" w:hAnsi="Consolas" w:cs="Consolas"/>
+          <w:sz w:val="17"/>
+          <w:szCs w:val="17"/>
+        </w:rPr>
+        <w:t>1. `gh repo view &lt;my-username&gt;/my-ai-os --json visibility` says PRIVATE (get my username with `gh api user --jq .login`).</w:t>
+      </w:r>
+    </w:p>
+    <w:p>
+      <w:pPr>
+        <w:pBdr>
+          <w:left w:val="single" w:sz="12" w:space="4" w:color="4F46E5"/>
+          <w:right w:val="single" w:sz="12" w:space="4" w:color="4F46E5"/>
+        </w:pBdr>
+        <w:shd w:val="clear" w:color="auto" w:fill="F5F3FF"/>
+        <w:spacing w:after="60" w:line="250" w:lineRule="auto"/>
+        <w:ind w:left="120" w:right="120"/>
+      </w:pPr>
+      <w:r>
+        <w:rPr>
+          <w:rFonts w:ascii="Consolas" w:eastAsia="Consolas" w:hAnsi="Consolas" w:cs="Consolas"/>
+          <w:sz w:val="17"/>
+          <w:szCs w:val="17"/>
+        </w:rPr>
+        <w:t>2. The folder my-ai-os in my home folder contains CLAUDE.md, .claude/skills (17 folders) and .claude/agents (6 files).</w:t>
+      </w:r>
+    </w:p>
+    <w:p>
+      <w:pPr>
+        <w:pBdr>
+          <w:left w:val="single" w:sz="12" w:space="4" w:color="4F46E5"/>
+          <w:right w:val="single" w:sz="12" w:space="4" w:color="4F46E5"/>
+        </w:pBdr>
+        <w:shd w:val="clear" w:color="auto" w:fill="F5F3FF"/>
+        <w:spacing w:after="60" w:line="250" w:lineRule="auto"/>
+        <w:ind w:left="120" w:right="120"/>
+      </w:pPr>
+      <w:r>
+        <w:rPr>
+          <w:rFonts w:ascii="Consolas" w:eastAsia="Consolas" w:hAnsi="Consolas" w:cs="Consolas"/>
+          <w:sz w:val="17"/>
+          <w:szCs w:val="17"/>
+        </w:rPr>
+        <w:t>3. `git config --global user.name` and `git config --global user.email` both print a value.</w:t>
+      </w:r>
+    </w:p>
+    <w:p>
+      <w:pPr>
+        <w:pBdr>
+          <w:left w:val="single" w:sz="12" w:space="4" w:color="4F46E5"/>
+          <w:right w:val="single" w:sz="12" w:space="4" w:color="4F46E5"/>
+        </w:pBdr>
+        <w:shd w:val="clear" w:color="auto" w:fill="F5F3FF"/>
+        <w:spacing w:after="60" w:line="250" w:lineRule="auto"/>
+        <w:ind w:left="120" w:right="120"/>
+      </w:pPr>
+      <w:r>
+        <w:rPr>
+          <w:rFonts w:ascii="Consolas" w:eastAsia="Consolas" w:hAnsi="Consolas" w:cs="Consolas"/>
+          <w:sz w:val="17"/>
+          <w:szCs w:val="17"/>
+        </w:rPr>
+        <w:t>HOW:</w:t>
+      </w:r>
+    </w:p>
+    <w:p>
+      <w:pPr>
+        <w:pBdr>
+          <w:left w:val="single" w:sz="12" w:space="4" w:color="4F46E5"/>
+          <w:right w:val="single" w:sz="12" w:space="4" w:color="4F46E5"/>
+        </w:pBdr>
+        <w:shd w:val="clear" w:color="auto" w:fill="F5F3FF"/>
+        <w:spacing w:after="60" w:line="250" w:lineRule="auto"/>
+        <w:ind w:left="120" w:right="120"/>
+      </w:pPr>
+      <w:r>
+        <w:rPr>
+          <w:rFonts w:ascii="Consolas" w:eastAsia="Consolas" w:hAnsi="Consolas" w:cs="Consolas"/>
+          <w:sz w:val="17"/>
+          <w:szCs w:val="17"/>
+        </w:rPr>
+        <w:t>- Check the GitHub CLI is installed (`gh --version`). If it is not, tell me how to install it on my computer and wait for me.</w:t>
+      </w:r>
+    </w:p>
+    <w:p>
+      <w:pPr>
+        <w:pBdr>
+          <w:left w:val="single" w:sz="12" w:space="4" w:color="4F46E5"/>
+          <w:right w:val="single" w:sz="12" w:space="4" w:color="4F46E5"/>
+        </w:pBdr>
+        <w:shd w:val="clear" w:color="auto" w:fill="F5F3FF"/>
+        <w:spacing w:after="60" w:line="250" w:lineRule="auto"/>
+        <w:ind w:left="120" w:right="120"/>
+      </w:pPr>
+      <w:r>
+        <w:rPr>
+          <w:rFonts w:ascii="Consolas" w:eastAsia="Consolas" w:hAnsi="Consolas" w:cs="Consolas"/>
+          <w:sz w:val="17"/>
+          <w:szCs w:val="17"/>
+        </w:rPr>
+        <w:t>- Check I am logged in (`gh auth status`). If not, ask me to type `! gh auth login` myself (it needs my browser), choosing GitHub.com, HTTPS, and "Login with a web browser". Wait for me.</w:t>
+      </w:r>
+    </w:p>
+    <w:p>
+      <w:pPr>
+        <w:pBdr>
+          <w:left w:val="single" w:sz="12" w:space="4" w:color="4F46E5"/>
+          <w:right w:val="single" w:sz="12" w:space="4" w:color="4F46E5"/>
+        </w:pBdr>
+        <w:shd w:val="clear" w:color="auto" w:fill="F5F3FF"/>
+        <w:spacing w:after="60" w:line="250" w:lineRule="auto"/>
+        <w:ind w:left="120" w:right="120"/>
+      </w:pPr>
+      <w:r>
+        <w:rPr>
+          <w:rFonts w:ascii="Consolas" w:eastAsia="Consolas" w:hAnsi="Consolas" w:cs="Consolas"/>
+          <w:sz w:val="17"/>
+          <w:szCs w:val="17"/>
+        </w:rPr>
+        <w:t>- Ask me what to call the repo (suggest my-ai-os). If I pick another name, use it everywhere below.</w:t>
+      </w:r>
+    </w:p>
+    <w:p>
+      <w:pPr>
+        <w:pBdr>
+          <w:left w:val="single" w:sz="12" w:space="4" w:color="4F46E5"/>
+          <w:right w:val="single" w:sz="12" w:space="4" w:color="4F46E5"/>
+        </w:pBdr>
+        <w:shd w:val="clear" w:color="auto" w:fill="F5F3FF"/>
+        <w:spacing w:after="60" w:line="250" w:lineRule="auto"/>
+        <w:ind w:left="120" w:right="120"/>
+      </w:pPr>
+      <w:r>
+        <w:rPr>
+          <w:rFonts w:ascii="Consolas" w:eastAsia="Consolas" w:hAnsi="Consolas" w:cs="Consolas"/>
+          <w:sz w:val="17"/>
+          <w:szCs w:val="17"/>
+        </w:rPr>
+        <w:t>- From my home folder, run: gh repo create my-ai-os --private --template jacksnell2804-bro/claude-code-starter-os --clone</w:t>
+      </w:r>
+    </w:p>
+    <w:p>
+      <w:pPr>
+        <w:pBdr>
+          <w:left w:val="single" w:sz="12" w:space="4" w:color="4F46E5"/>
+          <w:right w:val="single" w:sz="12" w:space="4" w:color="4F46E5"/>
+        </w:pBdr>
+        <w:shd w:val="clear" w:color="auto" w:fill="F5F3FF"/>
+        <w:spacing w:after="60" w:line="250" w:lineRule="auto"/>
+        <w:ind w:left="120" w:right="120"/>
+      </w:pPr>
+      <w:r>
+        <w:rPr>
+          <w:rFonts w:ascii="Consolas" w:eastAsia="Consolas" w:hAnsi="Consolas" w:cs="Consolas"/>
+          <w:sz w:val="17"/>
+          <w:szCs w:val="17"/>
+        </w:rPr>
+        <w:t>- If the new folder comes down empty, wait 10 seconds and run `git pull` inside it (GitHub copies templates in the background).</w:t>
+      </w:r>
+    </w:p>
+    <w:p>
+      <w:pPr>
+        <w:pBdr>
+          <w:left w:val="single" w:sz="12" w:space="4" w:color="4F46E5"/>
+          <w:right w:val="single" w:sz="12" w:space="4" w:color="4F46E5"/>
+        </w:pBdr>
+        <w:shd w:val="clear" w:color="auto" w:fill="F5F3FF"/>
+        <w:spacing w:after="60" w:line="250" w:lineRule="auto"/>
+        <w:ind w:left="120" w:right="120"/>
+      </w:pPr>
+      <w:r>
+        <w:rPr>
+          <w:rFonts w:ascii="Consolas" w:eastAsia="Consolas" w:hAnsi="Consolas" w:cs="Consolas"/>
+          <w:sz w:val="17"/>
+          <w:szCs w:val="17"/>
+        </w:rPr>
+        <w:t>- If my git name or email is not set, ask me for them (use the email on my GitHub account) and set them with `git config --global`.</w:t>
+      </w:r>
+    </w:p>
+    <w:p>
+      <w:pPr>
+        <w:pBdr>
+          <w:left w:val="single" w:sz="12" w:space="4" w:color="4F46E5"/>
+          <w:right w:val="single" w:sz="12" w:space="4" w:color="4F46E5"/>
+        </w:pBdr>
+        <w:shd w:val="clear" w:color="auto" w:fill="F5F3FF"/>
+        <w:spacing w:after="60" w:line="250" w:lineRule="auto"/>
+        <w:ind w:left="120" w:right="120"/>
+      </w:pPr>
+      <w:r>
+        <w:rPr>
+          <w:rFonts w:ascii="Consolas" w:eastAsia="Consolas" w:hAnsi="Consolas" w:cs="Consolas"/>
+          <w:sz w:val="17"/>
+          <w:szCs w:val="17"/>
+        </w:rPr>
+        <w:t>RULES:</w:t>
+      </w:r>
+    </w:p>
+    <w:p>
+      <w:pPr>
+        <w:pBdr>
+          <w:left w:val="single" w:sz="12" w:space="4" w:color="4F46E5"/>
+          <w:right w:val="single" w:sz="12" w:space="4" w:color="4F46E5"/>
+        </w:pBdr>
+        <w:shd w:val="clear" w:color="auto" w:fill="F5F3FF"/>
+        <w:spacing w:after="60" w:line="250" w:lineRule="auto"/>
+        <w:ind w:left="120" w:right="120"/>
+      </w:pPr>
+      <w:r>
+        <w:rPr>
+          <w:rFonts w:ascii="Consolas" w:eastAsia="Consolas" w:hAnsi="Consolas" w:cs="Consolas"/>
+          <w:sz w:val="17"/>
+          <w:szCs w:val="17"/>
+        </w:rPr>
+        <w:t>- The repo MUST be private. Never create it as public or change it to public: it will hold my personal details.</w:t>
+      </w:r>
+    </w:p>
+    <w:p>
+      <w:pPr>
+        <w:pBdr>
+          <w:left w:val="single" w:sz="12" w:space="4" w:color="4F46E5"/>
+          <w:right w:val="single" w:sz="12" w:space="4" w:color="4F46E5"/>
+        </w:pBdr>
+        <w:shd w:val="clear" w:color="auto" w:fill="F5F3FF"/>
+        <w:spacing w:after="60" w:line="250" w:lineRule="auto"/>
+        <w:ind w:left="120" w:right="120"/>
+      </w:pPr>
+      <w:r>
+        <w:rPr>
+          <w:rFonts w:ascii="Consolas" w:eastAsia="Consolas" w:hAnsi="Consolas" w:cs="Consolas"/>
+          <w:sz w:val="17"/>
+          <w:szCs w:val="17"/>
+        </w:rPr>
+        <w:t>- Never push anything to jacksnell2804-bro/claude-code-starter-os. That is the shared template, not mine.</w:t>
+      </w:r>
+    </w:p>
+    <w:p>
+      <w:pPr>
+        <w:pBdr>
+          <w:left w:val="single" w:sz="12" w:space="4" w:color="4F46E5"/>
+          <w:right w:val="single" w:sz="12" w:space="4" w:color="4F46E5"/>
+        </w:pBdr>
+        <w:shd w:val="clear" w:color="auto" w:fill="F5F3FF"/>
+        <w:spacing w:after="60" w:line="250" w:lineRule="auto"/>
+        <w:ind w:left="120" w:right="120"/>
+      </w:pPr>
+      <w:r>
+        <w:rPr>
+          <w:rFonts w:ascii="Consolas" w:eastAsia="Consolas" w:hAnsi="Consolas" w:cs="Consolas"/>
+          <w:sz w:val="17"/>
+          <w:szCs w:val="17"/>
+        </w:rPr>
+        <w:t>- Do not change or delete anything outside the new folder.</w:t>
+      </w:r>
+    </w:p>
+    <w:p>
+      <w:pPr>
+        <w:pBdr>
+          <w:left w:val="single" w:sz="12" w:space="4" w:color="4F46E5"/>
+          <w:right w:val="single" w:sz="12" w:space="4" w:color="4F46E5"/>
+        </w:pBdr>
+        <w:shd w:val="clear" w:color="auto" w:fill="F5F3FF"/>
+        <w:spacing w:after="60" w:line="250" w:lineRule="auto"/>
+        <w:ind w:left="120" w:right="120"/>
+      </w:pPr>
+      <w:r>
+        <w:rPr>
+          <w:rFonts w:ascii="Consolas" w:eastAsia="Consolas" w:hAnsi="Consolas" w:cs="Consolas"/>
+          <w:sz w:val="17"/>
+          <w:szCs w:val="17"/>
+        </w:rPr>
+        <w:t>- Ask me before installing any software.</w:t>
+      </w:r>
+    </w:p>
+    <w:p>
+      <w:pPr>
+        <w:pBdr>
+          <w:left w:val="single" w:sz="12" w:space="4" w:color="4F46E5"/>
+          <w:right w:val="single" w:sz="12" w:space="4" w:color="4F46E5"/>
+        </w:pBdr>
+        <w:shd w:val="clear" w:color="auto" w:fill="F5F3FF"/>
+        <w:spacing w:after="60" w:line="250" w:lineRule="auto"/>
+        <w:ind w:left="120" w:right="120"/>
+      </w:pPr>
+      <w:r>
+        <w:rPr>
+          <w:rFonts w:ascii="Consolas" w:eastAsia="Consolas" w:hAnsi="Consolas" w:cs="Consolas"/>
+          <w:sz w:val="17"/>
+          <w:szCs w:val="17"/>
+        </w:rPr>
+        <w:t>- If a step fails, show me the exact error and explain it before trying anything else.</w:t>
+      </w:r>
+    </w:p>
+    <w:p>
+      <w:pPr>
+        <w:pBdr>
+          <w:left w:val="single" w:sz="12" w:space="4" w:color="4F46E5"/>
+          <w:bottom w:val="single" w:sz="12" w:space="4" w:color="4F46E5"/>
+          <w:right w:val="single" w:sz="12" w:space="4" w:color="4F46E5"/>
+        </w:pBdr>
+        <w:shd w:val="clear" w:color="auto" w:fill="F5F3FF"/>
+        <w:spacing w:after="200" w:line="250" w:lineRule="auto"/>
+        <w:ind w:left="120" w:right="120"/>
+      </w:pPr>
+      <w:r>
+        <w:rPr>
+          <w:rFonts w:ascii="Consolas" w:eastAsia="Consolas" w:hAnsi="Consolas" w:cs="Consolas"/>
+          <w:sz w:val="17"/>
+          <w:szCs w:val="17"/>
+        </w:rPr>
+        <w:t>WHEN DONE: show me the three proofs. Then tell me to type /exit, then run `cd ~/my-ai-os` and `claude` (this matters: my skills only load when Claude starts inside that folder), and then to say "set me up".</w:t>
+      </w:r>
+    </w:p>
+    <w:p>
+      <w:pPr>
+        <w:spacing w:after="120" w:line="300" w:lineRule="auto"/>
+      </w:pPr>
+      <w:r>
+        <w:rPr>
+          <w:b/>
+          <w:bCs/>
+        </w:rPr>
+        <w:t>What you will see:</w:t>
+      </w:r>
+      <w:r>
+        <w:t xml:space="preserve"> Claude checks for the GitHub CLI (and asks before installing anything), asks you to type </w:t>
+      </w:r>
+      <w:r>
+        <w:rPr>
+          <w:rFonts w:ascii="Consolas" w:eastAsia="Consolas" w:hAnsi="Consolas" w:cs="Consolas"/>
+          <w:color w:val="7C2D12"/>
+          <w:sz w:val="19"/>
+          <w:szCs w:val="19"/>
+        </w:rPr>
+        <w:t>! gh auth login</w:t>
+      </w:r>
+      <w:r>
+        <w:t xml:space="preserve"> so you can log in through your browser, asks what to call the repo, creates and downloads it, then shows you three proofs: the repo is PRIVATE, the folder has all 17 skills and 6 agents, and git knows your name and email.</w:t>
+      </w:r>
+    </w:p>
+    <w:p>
+      <w:pPr>
+        <w:pBdr>
+          <w:left w:val="single" w:sz="18" w:space="6" w:color="4F46E5"/>
+        </w:pBdr>
+        <w:shd w:val="clear" w:color="auto" w:fill="EEF2FF"/>
+        <w:spacing w:before="120" w:after="40" w:line="290" w:lineRule="auto"/>
+        <w:ind w:left="200" w:right="200"/>
+      </w:pPr>
+      <w:r>
+        <w:rPr>
+          <w:b/>
+          <w:bCs/>
+          <w:color w:val="4F46E5"/>
+        </w:rPr>
+        <w:t>If anything goes wrong</w:t>
+      </w:r>
+    </w:p>
+    <w:p>
+      <w:pPr>
+        <w:pBdr>
+          <w:left w:val="single" w:sz="18" w:space="6" w:color="4F46E5"/>
+        </w:pBdr>
+        <w:shd w:val="clear" w:color="auto" w:fill="EEF2FF"/>
+        <w:spacing w:after="200" w:line="290" w:lineRule="auto"/>
+        <w:ind w:left="200" w:right="200"/>
+      </w:pPr>
+      <w:r>
+        <w:t>Copy the full error message, paste it into Claude, and say "help me fix this, explain each step". Claude is very good at fixing its own setup, and it is the fastest way to learn the terminal.</w:t>
+      </w:r>
+    </w:p>
+    <w:p>
+      <w:pPr>
+        <w:pStyle w:val="Heading2"/>
+      </w:pPr>
+      <w:r>
+        <w:lastRenderedPageBreak/>
+        <w:t>Prefer to do it by hand?</w:t>
+      </w:r>
+    </w:p>
+    <w:p>
+      <w:pPr>
+        <w:pStyle w:val="ListParagraph"/>
+        <w:numPr>
+          <w:ilvl w:val="0"/>
+          <w:numId w:val="4"/>
+        </w:numPr>
+        <w:spacing w:after="80" w:line="290" w:lineRule="auto"/>
+      </w:pPr>
+      <w:r>
+        <w:t xml:space="preserve">On github.com/jacksnell2804-bro/claude-code-starter-os click </w:t>
+      </w:r>
+      <w:r>
+        <w:rPr>
+          <w:b/>
+          <w:bCs/>
+        </w:rPr>
+        <w:t>Use this template</w:t>
+      </w:r>
+      <w:r>
+        <w:t xml:space="preserve">, then </w:t>
+      </w:r>
+      <w:r>
+        <w:rPr>
+          <w:b/>
+          <w:bCs/>
+        </w:rPr>
+        <w:t>Create a new repository</w:t>
+      </w:r>
+      <w:r>
+        <w:t xml:space="preserve">, name it my-ai-os, choose </w:t>
+      </w:r>
+      <w:r>
+        <w:rPr>
+          <w:b/>
+          <w:bCs/>
+        </w:rPr>
+        <w:t>Private</w:t>
+      </w:r>
+      <w:r>
+        <w:t>.</w:t>
+      </w:r>
+    </w:p>
+    <w:p>
+      <w:pPr>
+        <w:pStyle w:val="ListParagraph"/>
+        <w:numPr>
+          <w:ilvl w:val="0"/>
+          <w:numId w:val="4"/>
+        </w:numPr>
+        <w:spacing w:after="80" w:line="290" w:lineRule="auto"/>
+      </w:pPr>
+      <w:r>
+        <w:t xml:space="preserve">Install the GitHub CLI (cli.github.com) and run </w:t>
       </w:r>
       <w:r>
         <w:rPr>
@@ -2662,8 +3443,49 @@
         <w:t>gh auth login</w:t>
       </w:r>
       <w:r>
-        <w:t xml:space="preserve"> (GitHub.com, HTTPS, web browser). Then </w:t>
-      </w:r>
+        <w:t xml:space="preserve"> (GitHub.com, HTTPS, web browser).</w:t>
+      </w:r>
+    </w:p>
+    <w:p>
+      <w:pPr>
+        <w:pStyle w:val="ListParagraph"/>
+        <w:numPr>
+          <w:ilvl w:val="0"/>
+          <w:numId w:val="4"/>
+        </w:numPr>
+        <w:spacing w:after="80" w:line="290" w:lineRule="auto"/>
+      </w:pPr>
+      <w:r>
+        <w:rPr>
+          <w:rFonts w:ascii="Consolas" w:eastAsia="Consolas" w:hAnsi="Consolas" w:cs="Consolas"/>
+          <w:color w:val="7C2D12"/>
+          <w:sz w:val="19"/>
+          <w:szCs w:val="19"/>
+        </w:rPr>
+        <w:t>cd ~</w:t>
+      </w:r>
+      <w:r>
+        <w:t xml:space="preserve"> then </w:t>
+      </w:r>
+      <w:r>
+        <w:rPr>
+          <w:rFonts w:ascii="Consolas" w:eastAsia="Consolas" w:hAnsi="Consolas" w:cs="Consolas"/>
+          <w:color w:val="7C2D12"/>
+          <w:sz w:val="19"/>
+          <w:szCs w:val="19"/>
+        </w:rPr>
+        <w:t>git clone https://github.com/&lt;your-username&gt;/my-ai-os.git</w:t>
+      </w:r>
+    </w:p>
+    <w:p>
+      <w:pPr>
+        <w:pStyle w:val="ListParagraph"/>
+        <w:numPr>
+          <w:ilvl w:val="0"/>
+          <w:numId w:val="4"/>
+        </w:numPr>
+        <w:spacing w:after="80" w:line="290" w:lineRule="auto"/>
+      </w:pPr>
       <w:r>
         <w:rPr>
           <w:rFonts w:ascii="Consolas" w:eastAsia="Consolas" w:hAnsi="Consolas" w:cs="Consolas"/>
@@ -2686,196 +3508,7 @@
         <w:t>git config --global user.email "you@example.com"</w:t>
       </w:r>
       <w:r>
-        <w:t xml:space="preserve"> with your GitHub email.</w:t>
-      </w:r>
-    </w:p>
-    <w:p>
-      <w:pPr>
-        <w:pStyle w:val="ListParagraph"/>
-        <w:numPr>
-          <w:ilvl w:val="0"/>
-          <w:numId w:val="3"/>
-        </w:numPr>
-        <w:spacing w:after="80" w:line="290" w:lineRule="auto"/>
-      </w:pPr>
-      <w:r>
-        <w:rPr>
-          <w:b/>
-          <w:bCs/>
-        </w:rPr>
-        <w:t>Download your copy</w:t>
-      </w:r>
-      <w:r>
-        <w:t xml:space="preserve">: </w:t>
-      </w:r>
-      <w:r>
-        <w:rPr>
-          <w:rFonts w:ascii="Consolas" w:eastAsia="Consolas" w:hAnsi="Consolas" w:cs="Consolas"/>
-          <w:color w:val="7C2D12"/>
-          <w:sz w:val="19"/>
-          <w:szCs w:val="19"/>
-        </w:rPr>
-        <w:t>git clone https://github.com/&lt;you&gt;/my-ai-os.git</w:t>
-      </w:r>
-      <w:r>
-        <w:t xml:space="preserve"> then </w:t>
-      </w:r>
-      <w:r>
-        <w:rPr>
-          <w:rFonts w:ascii="Consolas" w:eastAsia="Consolas" w:hAnsi="Consolas" w:cs="Consolas"/>
-          <w:color w:val="7C2D12"/>
-          <w:sz w:val="19"/>
-          <w:szCs w:val="19"/>
-        </w:rPr>
-        <w:t>cd my-ai-os</w:t>
-      </w:r>
-      <w:r>
-        <w:t>.</w:t>
-      </w:r>
-    </w:p>
-    <w:p>
-      <w:pPr>
-        <w:pStyle w:val="ListParagraph"/>
-        <w:numPr>
-          <w:ilvl w:val="0"/>
-          <w:numId w:val="3"/>
-        </w:numPr>
-        <w:spacing w:after="80" w:line="290" w:lineRule="auto"/>
-      </w:pPr>
-      <w:r>
-        <w:rPr>
-          <w:b/>
-          <w:bCs/>
-        </w:rPr>
-        <w:t>Start Claude in that folder</w:t>
-      </w:r>
-      <w:r>
-        <w:t xml:space="preserve"> (in Orca, or </w:t>
-      </w:r>
-      <w:r>
-        <w:rPr>
-          <w:rFonts w:ascii="Consolas" w:eastAsia="Consolas" w:hAnsi="Consolas" w:cs="Consolas"/>
-          <w:color w:val="7C2D12"/>
-          <w:sz w:val="19"/>
-          <w:szCs w:val="19"/>
-        </w:rPr>
-        <w:t>claude</w:t>
-      </w:r>
-      <w:r>
-        <w:t xml:space="preserve"> in the terminal). When it asks if you trust the folder, say yes.</w:t>
-      </w:r>
-    </w:p>
-    <w:p>
-      <w:pPr>
-        <w:pStyle w:val="ListParagraph"/>
-        <w:numPr>
-          <w:ilvl w:val="0"/>
-          <w:numId w:val="3"/>
-        </w:numPr>
-        <w:spacing w:after="80" w:line="290" w:lineRule="auto"/>
-      </w:pPr>
-      <w:r>
-        <w:rPr>
-          <w:b/>
-          <w:bCs/>
-        </w:rPr>
-        <w:t>Say "set me up".</w:t>
-      </w:r>
-      <w:r>
-        <w:t xml:space="preserve"> Claude interviews you about ten questions and fills in who you are, your units, deadlines and goals.</w:t>
-      </w:r>
-    </w:p>
-    <w:p>
-      <w:pPr>
-        <w:pStyle w:val="ListParagraph"/>
-        <w:numPr>
-          <w:ilvl w:val="0"/>
-          <w:numId w:val="3"/>
-        </w:numPr>
-        <w:spacing w:after="80" w:line="290" w:lineRule="auto"/>
-      </w:pPr>
-      <w:r>
-        <w:rPr>
-          <w:b/>
-          <w:bCs/>
-        </w:rPr>
-        <w:t>Say "set up g-brain".</w:t>
-      </w:r>
-      <w:r>
-        <w:t xml:space="preserve"> Claude installs and connects your long-term memory (Part 7).</w:t>
-      </w:r>
-    </w:p>
-    <w:p>
-      <w:pPr>
-        <w:pStyle w:val="ListParagraph"/>
-        <w:numPr>
-          <w:ilvl w:val="0"/>
-          <w:numId w:val="3"/>
-        </w:numPr>
-        <w:spacing w:after="80" w:line="290" w:lineRule="auto"/>
-      </w:pPr>
-      <w:r>
-        <w:rPr>
-          <w:b/>
-          <w:bCs/>
-        </w:rPr>
-        <w:t>Run the checker</w:t>
-      </w:r>
-      <w:r>
-        <w:t xml:space="preserve">: </w:t>
-      </w:r>
-      <w:r>
-        <w:rPr>
-          <w:rFonts w:ascii="Consolas" w:eastAsia="Consolas" w:hAnsi="Consolas" w:cs="Consolas"/>
-          <w:color w:val="7C2D12"/>
-          <w:sz w:val="19"/>
-          <w:szCs w:val="19"/>
-        </w:rPr>
-        <w:t>bash scripts/check-setup.sh</w:t>
-      </w:r>
-      <w:r>
-        <w:t xml:space="preserve">. Everything should say [ok]. On Windows, run it in </w:t>
-      </w:r>
-      <w:r>
-        <w:rPr>
-          <w:b/>
-          <w:bCs/>
-        </w:rPr>
-        <w:t>Git Bash</w:t>
-      </w:r>
-      <w:r>
-        <w:t xml:space="preserve"> (it came with Git for Windows), not PowerShell.</w:t>
-      </w:r>
-    </w:p>
-    <w:p>
-      <w:pPr>
-        <w:pBdr>
-          <w:left w:val="single" w:sz="18" w:space="6" w:color="4F46E5"/>
-        </w:pBdr>
-        <w:shd w:val="clear" w:color="auto" w:fill="EEF2FF"/>
-        <w:spacing w:before="120" w:after="40" w:line="290" w:lineRule="auto"/>
-        <w:ind w:left="200" w:right="200"/>
-      </w:pPr>
-      <w:r>
-        <w:rPr>
-          <w:b/>
-          <w:bCs/>
-          <w:color w:val="4F46E5"/>
-        </w:rPr>
-        <w:t>If anything goes wrong</w:t>
-      </w:r>
-    </w:p>
-    <w:p>
-      <w:pPr>
-        <w:pBdr>
-          <w:left w:val="single" w:sz="18" w:space="6" w:color="4F46E5"/>
-        </w:pBdr>
-        <w:shd w:val="clear" w:color="auto" w:fill="EEF2FF"/>
-        <w:spacing w:after="200" w:line="290" w:lineRule="auto"/>
-        <w:ind w:left="200" w:right="200"/>
-      </w:pPr>
-      <w:r>
-        <w:t>Copy the full error message, paste it into Claude, and say "help me fix this, explain each step". Claude is very good at fixing its own setup. That is also the fastest way to learn the terminal.</w:t>
+        <w:t xml:space="preserve"> (your GitHub email). Then carry on from step 6 above.</w:t>
       </w:r>
     </w:p>
     <w:p>
@@ -2883,7 +3516,7 @@
         <w:pStyle w:val="Heading1"/>
         <w:pageBreakBefore/>
       </w:pPr>
-      <w:bookmarkStart w:id="2" w:name="_Toc241667783"/>
+      <w:bookmarkStart w:id="2" w:name="_Toc241675036"/>
       <w:r>
         <w:lastRenderedPageBreak/>
         <w:t>3. How to operate Claude Code</w:t>
@@ -4046,6 +4679,7 @@
         <w:pStyle w:val="Heading2"/>
       </w:pPr>
       <w:r>
+        <w:lastRenderedPageBreak/>
         <w:t>Permissions: when Claude asks "can I do this?"</w:t>
       </w:r>
     </w:p>
@@ -4054,7 +4688,6 @@
         <w:spacing w:after="120" w:line="300" w:lineRule="auto"/>
       </w:pPr>
       <w:r>
-        <w:lastRenderedPageBreak/>
         <w:t xml:space="preserve">Claude asks before it runs commands or edits files. Read what it wants to do. You can approve once, approve always for that kind of command, or say no and tell it what to do instead. Your repo's </w:t>
       </w:r>
       <w:r>
@@ -5265,7 +5898,7 @@
         <w:pStyle w:val="Heading1"/>
         <w:pageBreakBefore/>
       </w:pPr>
-      <w:bookmarkStart w:id="3" w:name="_Toc241667784"/>
+      <w:bookmarkStart w:id="3" w:name="_Toc241675037"/>
       <w:r>
         <w:lastRenderedPageBreak/>
         <w:t>4. Models and effort: which to use when</w:t>
@@ -7407,7 +8040,7 @@
         <w:pStyle w:val="Heading1"/>
         <w:pageBreakBefore/>
       </w:pPr>
-      <w:bookmarkStart w:id="4" w:name="_Toc241667785"/>
+      <w:bookmarkStart w:id="4" w:name="_Toc241675038"/>
       <w:r>
         <w:lastRenderedPageBreak/>
         <w:t>5. How the folder structure works</w:t>
@@ -9510,7 +10143,7 @@
         <w:pStyle w:val="Heading1"/>
         <w:pageBreakBefore/>
       </w:pPr>
-      <w:bookmarkStart w:id="5" w:name="_Toc241667786"/>
+      <w:bookmarkStart w:id="5" w:name="_Toc241675039"/>
       <w:r>
         <w:lastRenderedPageBreak/>
         <w:t>6. Skills, agents and rules</w:t>
@@ -12074,7 +12707,7 @@
         <w:pStyle w:val="Heading1"/>
         <w:pageBreakBefore/>
       </w:pPr>
-      <w:bookmarkStart w:id="6" w:name="_Toc241667787"/>
+      <w:bookmarkStart w:id="6" w:name="_Toc241675040"/>
       <w:r>
         <w:lastRenderedPageBreak/>
         <w:t>7. G-Brain: your long-term memory</w:t>
@@ -13012,59 +13645,7 @@
         <w:t>CLAUDE.md</w:t>
       </w:r>
       <w:r>
-        <w:t xml:space="preserve"> tells Claude to search G-Brain before answering questions about your past work, to save decisions and lessons, and to sync your notes when you wrap up. Things you can say:</w:t>
-      </w:r>
-    </w:p>
-    <w:p>
-      <w:pPr>
-        <w:pStyle w:val="ListParagraph"/>
-        <w:numPr>
-          <w:ilvl w:val="0"/>
-          <w:numId w:val="2"/>
-        </w:numPr>
-        <w:spacing w:after="60" w:line="290" w:lineRule="auto"/>
-      </w:pPr>
-      <w:r>
-        <w:t>"Remember that..."</w:t>
-      </w:r>
-    </w:p>
-    <w:p>
-      <w:pPr>
-        <w:pStyle w:val="ListParagraph"/>
-        <w:numPr>
-          <w:ilvl w:val="0"/>
-          <w:numId w:val="2"/>
-        </w:numPr>
-        <w:spacing w:after="60" w:line="290" w:lineRule="auto"/>
-      </w:pPr>
-      <w:r>
-        <w:t>"What did I decide about...?"</w:t>
-      </w:r>
-    </w:p>
-    <w:p>
-      <w:pPr>
-        <w:pStyle w:val="ListParagraph"/>
-        <w:numPr>
-          <w:ilvl w:val="0"/>
-          <w:numId w:val="2"/>
-        </w:numPr>
-        <w:spacing w:after="60" w:line="290" w:lineRule="auto"/>
-      </w:pPr>
-      <w:r>
-        <w:t>"Search my brain for..."</w:t>
-      </w:r>
-    </w:p>
-    <w:p>
-      <w:pPr>
-        <w:pStyle w:val="ListParagraph"/>
-        <w:numPr>
-          <w:ilvl w:val="0"/>
-          <w:numId w:val="2"/>
-        </w:numPr>
-        <w:spacing w:after="60" w:line="290" w:lineRule="auto"/>
-      </w:pPr>
-      <w:r>
-        <w:t>"What do I know about...?"</w:t>
+        <w:t xml:space="preserve"> tells Claude to search G-Brain before answering questions about your past work, to save decisions and lessons, and to sync your notes when you wrap up. Things you can say: "remember that...", "what did I decide about...?", "search my brain for...", "what do I know about...?"</w:t>
       </w:r>
     </w:p>
     <w:p>
@@ -13169,7 +13750,6 @@
           <w:b/>
           <w:bCs/>
         </w:rPr>
-        <w:lastRenderedPageBreak/>
         <w:t>G-Brain in many parallel agents</w:t>
       </w:r>
       <w:r>
@@ -13181,7 +13761,7 @@
         <w:pStyle w:val="Heading1"/>
         <w:pageBreakBefore/>
       </w:pPr>
-      <w:bookmarkStart w:id="7" w:name="_Toc241667788"/>
+      <w:bookmarkStart w:id="7" w:name="_Toc241675041"/>
       <w:r>
         <w:lastRenderedPageBreak/>
         <w:t>8. Orca: running Claude like a team</w:t>
@@ -13226,7 +13806,7 @@
         <w:pStyle w:val="ListParagraph"/>
         <w:numPr>
           <w:ilvl w:val="0"/>
-          <w:numId w:val="4"/>
+          <w:numId w:val="5"/>
         </w:numPr>
         <w:spacing w:after="80" w:line="290" w:lineRule="auto"/>
       </w:pPr>
@@ -13239,7 +13819,7 @@
         <w:pStyle w:val="ListParagraph"/>
         <w:numPr>
           <w:ilvl w:val="0"/>
-          <w:numId w:val="4"/>
+          <w:numId w:val="5"/>
         </w:numPr>
         <w:spacing w:after="80" w:line="290" w:lineRule="auto"/>
       </w:pPr>
@@ -13264,7 +13844,7 @@
         <w:pStyle w:val="ListParagraph"/>
         <w:numPr>
           <w:ilvl w:val="0"/>
-          <w:numId w:val="4"/>
+          <w:numId w:val="5"/>
         </w:numPr>
         <w:spacing w:after="80" w:line="290" w:lineRule="auto"/>
       </w:pPr>
@@ -13393,7 +13973,7 @@
         <w:pStyle w:val="Heading1"/>
         <w:pageBreakBefore/>
       </w:pPr>
-      <w:bookmarkStart w:id="8" w:name="_Toc241667789"/>
+      <w:bookmarkStart w:id="8" w:name="_Toc241675042"/>
       <w:r>
         <w:lastRenderedPageBreak/>
         <w:t>9. Using it for university</w:t>
@@ -14300,7 +14880,7 @@
         <w:pStyle w:val="Heading1"/>
         <w:pageBreakBefore/>
       </w:pPr>
-      <w:bookmarkStart w:id="9" w:name="_Toc241667790"/>
+      <w:bookmarkStart w:id="9" w:name="_Toc241675043"/>
       <w:r>
         <w:lastRenderedPageBreak/>
         <w:t>10. Building your own agents</w:t>
@@ -16195,7 +16775,7 @@
         <w:pStyle w:val="Heading1"/>
         <w:pageBreakBefore/>
       </w:pPr>
-      <w:bookmarkStart w:id="10" w:name="_Toc241667791"/>
+      <w:bookmarkStart w:id="10" w:name="_Toc241675044"/>
       <w:r>
         <w:lastRenderedPageBreak/>
         <w:t>11. Vibe coding: building with AI when you are new</w:t>
@@ -16223,7 +16803,7 @@
         <w:pStyle w:val="ListParagraph"/>
         <w:numPr>
           <w:ilvl w:val="0"/>
-          <w:numId w:val="5"/>
+          <w:numId w:val="6"/>
         </w:numPr>
         <w:spacing w:after="80" w:line="290" w:lineRule="auto"/>
       </w:pPr>
@@ -16243,7 +16823,7 @@
         <w:pStyle w:val="ListParagraph"/>
         <w:numPr>
           <w:ilvl w:val="0"/>
-          <w:numId w:val="5"/>
+          <w:numId w:val="6"/>
         </w:numPr>
         <w:spacing w:after="80" w:line="290" w:lineRule="auto"/>
       </w:pPr>
@@ -16263,7 +16843,7 @@
         <w:pStyle w:val="ListParagraph"/>
         <w:numPr>
           <w:ilvl w:val="0"/>
-          <w:numId w:val="5"/>
+          <w:numId w:val="6"/>
         </w:numPr>
         <w:spacing w:after="80" w:line="290" w:lineRule="auto"/>
       </w:pPr>
@@ -16283,7 +16863,7 @@
         <w:pStyle w:val="ListParagraph"/>
         <w:numPr>
           <w:ilvl w:val="0"/>
-          <w:numId w:val="5"/>
+          <w:numId w:val="6"/>
         </w:numPr>
         <w:spacing w:after="80" w:line="290" w:lineRule="auto"/>
       </w:pPr>
@@ -16303,7 +16883,7 @@
         <w:pStyle w:val="ListParagraph"/>
         <w:numPr>
           <w:ilvl w:val="0"/>
-          <w:numId w:val="5"/>
+          <w:numId w:val="6"/>
         </w:numPr>
         <w:spacing w:after="80" w:line="290" w:lineRule="auto"/>
       </w:pPr>
@@ -16323,7 +16903,7 @@
         <w:pStyle w:val="ListParagraph"/>
         <w:numPr>
           <w:ilvl w:val="0"/>
-          <w:numId w:val="5"/>
+          <w:numId w:val="6"/>
         </w:numPr>
         <w:spacing w:after="80" w:line="290" w:lineRule="auto"/>
       </w:pPr>
@@ -16343,7 +16923,7 @@
         <w:pStyle w:val="ListParagraph"/>
         <w:numPr>
           <w:ilvl w:val="0"/>
-          <w:numId w:val="5"/>
+          <w:numId w:val="6"/>
         </w:numPr>
         <w:spacing w:after="80" w:line="290" w:lineRule="auto"/>
       </w:pPr>
@@ -16363,7 +16943,7 @@
         <w:pStyle w:val="ListParagraph"/>
         <w:numPr>
           <w:ilvl w:val="0"/>
-          <w:numId w:val="5"/>
+          <w:numId w:val="6"/>
         </w:numPr>
         <w:spacing w:after="80" w:line="290" w:lineRule="auto"/>
       </w:pPr>
@@ -16383,7 +16963,7 @@
         <w:pStyle w:val="ListParagraph"/>
         <w:numPr>
           <w:ilvl w:val="0"/>
-          <w:numId w:val="5"/>
+          <w:numId w:val="6"/>
         </w:numPr>
         <w:spacing w:after="80" w:line="290" w:lineRule="auto"/>
       </w:pPr>
@@ -16403,7 +16983,7 @@
         <w:pStyle w:val="ListParagraph"/>
         <w:numPr>
           <w:ilvl w:val="0"/>
-          <w:numId w:val="5"/>
+          <w:numId w:val="6"/>
         </w:numPr>
         <w:spacing w:after="80" w:line="290" w:lineRule="auto"/>
       </w:pPr>
@@ -16423,7 +17003,7 @@
         <w:pStyle w:val="ListParagraph"/>
         <w:numPr>
           <w:ilvl w:val="0"/>
-          <w:numId w:val="5"/>
+          <w:numId w:val="6"/>
         </w:numPr>
         <w:spacing w:after="80" w:line="290" w:lineRule="auto"/>
       </w:pPr>
@@ -16443,7 +17023,7 @@
         <w:pStyle w:val="ListParagraph"/>
         <w:numPr>
           <w:ilvl w:val="0"/>
-          <w:numId w:val="5"/>
+          <w:numId w:val="6"/>
         </w:numPr>
         <w:spacing w:after="80" w:line="290" w:lineRule="auto"/>
       </w:pPr>
@@ -16977,7 +17557,7 @@
         <w:pStyle w:val="Heading1"/>
         <w:pageBreakBefore/>
       </w:pPr>
-      <w:bookmarkStart w:id="11" w:name="_Toc241667792"/>
+      <w:bookmarkStart w:id="11" w:name="_Toc241675045"/>
       <w:r>
         <w:lastRenderedPageBreak/>
         <w:t>12. Habits that separate good users from great ones</w:t>
@@ -17720,7 +18300,7 @@
         <w:pStyle w:val="Heading1"/>
         <w:pageBreakBefore/>
       </w:pPr>
-      <w:bookmarkStart w:id="12" w:name="_Toc241667793"/>
+      <w:bookmarkStart w:id="12" w:name="_Toc241675046"/>
       <w:r>
         <w:lastRenderedPageBreak/>
         <w:t>13. Troubleshooting</w:t>
@@ -18595,7 +19175,7 @@
         <w:pStyle w:val="Heading1"/>
         <w:pageBreakBefore/>
       </w:pPr>
-      <w:bookmarkStart w:id="13" w:name="_Toc241667794"/>
+      <w:bookmarkStart w:id="13" w:name="_Toc241675047"/>
       <w:r>
         <w:lastRenderedPageBreak/>
         <w:t>14. Glossary</w:t>
@@ -20332,7 +20912,7 @@
         <w:pStyle w:val="Heading1"/>
         <w:pageBreakBefore/>
       </w:pPr>
-      <w:bookmarkStart w:id="14" w:name="_Toc241667795"/>
+      <w:bookmarkStart w:id="14" w:name="_Toc241675048"/>
       <w:r>
         <w:lastRenderedPageBreak/>
         <w:t>15. Your first week</w:t>
@@ -21112,6 +21692,257 @@
           <w:szCs w:val="26"/>
         </w:rPr>
         <w:t>Build what you need. Prove it works. Write it down.</w:t>
+      </w:r>
+    </w:p>
+    <w:p>
+      <w:pPr>
+        <w:pStyle w:val="Heading1"/>
+        <w:pageBreakBefore/>
+      </w:pPr>
+      <w:bookmarkStart w:id="15" w:name="_Toc241675049"/>
+      <w:r>
+        <w:lastRenderedPageBreak/>
+        <w:t>Appendix: copy-paste prompts</w:t>
+      </w:r>
+      <w:bookmarkEnd w:id="15"/>
+    </w:p>
+    <w:p>
+      <w:pPr>
+        <w:spacing w:after="120" w:line="300" w:lineRule="auto"/>
+      </w:pPr>
+      <w:r>
+        <w:t>Starter prompts for the moments that matter. Paste as-is, or change the words in angle brackets.</w:t>
+      </w:r>
+    </w:p>
+    <w:p>
+      <w:pPr>
+        <w:pStyle w:val="Heading2"/>
+      </w:pPr>
+      <w:r>
+        <w:t>1. The very first prompt (private copy)</w:t>
+      </w:r>
+    </w:p>
+    <w:p>
+      <w:pPr>
+        <w:spacing w:after="120" w:line="300" w:lineRule="auto"/>
+      </w:pPr>
+      <w:r>
+        <w:t xml:space="preserve">The full prompt is in Part 2 (and in your repo at </w:t>
+      </w:r>
+      <w:r>
+        <w:rPr>
+          <w:rFonts w:ascii="Consolas" w:eastAsia="Consolas" w:hAnsi="Consolas" w:cs="Consolas"/>
+          <w:color w:val="7C2D12"/>
+          <w:sz w:val="19"/>
+          <w:szCs w:val="19"/>
+        </w:rPr>
+        <w:t>docs/first-prompt.md</w:t>
+      </w:r>
+      <w:r>
+        <w:t>).</w:t>
+      </w:r>
+    </w:p>
+    <w:p>
+      <w:pPr>
+        <w:pStyle w:val="Heading2"/>
+      </w:pPr>
+      <w:r>
+        <w:t>2. First session inside your copy</w:t>
+      </w:r>
+    </w:p>
+    <w:p>
+      <w:pPr>
+        <w:pBdr>
+          <w:top w:val="single" w:sz="12" w:space="4" w:color="4F46E5"/>
+          <w:left w:val="single" w:sz="12" w:space="4" w:color="4F46E5"/>
+          <w:bottom w:val="single" w:sz="12" w:space="4" w:color="4F46E5"/>
+          <w:right w:val="single" w:sz="12" w:space="4" w:color="4F46E5"/>
+        </w:pBdr>
+        <w:shd w:val="clear" w:color="auto" w:fill="F5F3FF"/>
+        <w:spacing w:before="120" w:after="200" w:line="250" w:lineRule="auto"/>
+        <w:ind w:left="120" w:right="120"/>
+      </w:pPr>
+      <w:r>
+        <w:rPr>
+          <w:rFonts w:ascii="Consolas" w:eastAsia="Consolas" w:hAnsi="Consolas" w:cs="Consolas"/>
+          <w:sz w:val="17"/>
+          <w:szCs w:val="17"/>
+        </w:rPr>
+        <w:t>set me up</w:t>
+      </w:r>
+    </w:p>
+    <w:p>
+      <w:pPr>
+        <w:pStyle w:val="Heading2"/>
+      </w:pPr>
+      <w:r>
+        <w:t>3. Connect your memory</w:t>
+      </w:r>
+    </w:p>
+    <w:p>
+      <w:pPr>
+        <w:pBdr>
+          <w:top w:val="single" w:sz="12" w:space="4" w:color="4F46E5"/>
+          <w:left w:val="single" w:sz="12" w:space="4" w:color="4F46E5"/>
+          <w:bottom w:val="single" w:sz="12" w:space="4" w:color="4F46E5"/>
+          <w:right w:val="single" w:sz="12" w:space="4" w:color="4F46E5"/>
+        </w:pBdr>
+        <w:shd w:val="clear" w:color="auto" w:fill="F5F3FF"/>
+        <w:spacing w:before="120" w:after="200" w:line="250" w:lineRule="auto"/>
+        <w:ind w:left="120" w:right="120"/>
+      </w:pPr>
+      <w:r>
+        <w:rPr>
+          <w:rFonts w:ascii="Consolas" w:eastAsia="Consolas" w:hAnsi="Consolas" w:cs="Consolas"/>
+          <w:sz w:val="17"/>
+          <w:szCs w:val="17"/>
+        </w:rPr>
+        <w:t>set up g-brain</w:t>
+      </w:r>
+    </w:p>
+    <w:p>
+      <w:pPr>
+        <w:pStyle w:val="Heading2"/>
+      </w:pPr>
+      <w:r>
+        <w:t>4. After a lecture</w:t>
+      </w:r>
+    </w:p>
+    <w:p>
+      <w:pPr>
+        <w:pBdr>
+          <w:top w:val="single" w:sz="12" w:space="4" w:color="4F46E5"/>
+          <w:left w:val="single" w:sz="12" w:space="4" w:color="4F46E5"/>
+          <w:bottom w:val="single" w:sz="12" w:space="4" w:color="4F46E5"/>
+          <w:right w:val="single" w:sz="12" w:space="4" w:color="4F46E5"/>
+        </w:pBdr>
+        <w:shd w:val="clear" w:color="auto" w:fill="F5F3FF"/>
+        <w:spacing w:before="120" w:after="200" w:line="250" w:lineRule="auto"/>
+        <w:ind w:left="120" w:right="120"/>
+      </w:pPr>
+      <w:r>
+        <w:rPr>
+          <w:rFonts w:ascii="Consolas" w:eastAsia="Consolas" w:hAnsi="Consolas" w:cs="Consolas"/>
+          <w:sz w:val="17"/>
+          <w:szCs w:val="17"/>
+        </w:rPr>
+        <w:t>I've dropped the week &lt;n&gt; slides for &lt;UNIT&gt; in uni/_inbox/. Make notes, then quiz me with 5 quick questions.</w:t>
+      </w:r>
+    </w:p>
+    <w:p>
+      <w:pPr>
+        <w:pStyle w:val="Heading2"/>
+      </w:pPr>
+      <w:r>
+        <w:t>5. New assignment</w:t>
+      </w:r>
+    </w:p>
+    <w:p>
+      <w:pPr>
+        <w:pBdr>
+          <w:top w:val="single" w:sz="12" w:space="4" w:color="4F46E5"/>
+          <w:left w:val="single" w:sz="12" w:space="4" w:color="4F46E5"/>
+          <w:bottom w:val="single" w:sz="12" w:space="4" w:color="4F46E5"/>
+          <w:right w:val="single" w:sz="12" w:space="4" w:color="4F46E5"/>
+        </w:pBdr>
+        <w:shd w:val="clear" w:color="auto" w:fill="F5F3FF"/>
+        <w:spacing w:before="120" w:after="200" w:line="250" w:lineRule="auto"/>
+        <w:ind w:left="120" w:right="120"/>
+      </w:pPr>
+      <w:r>
+        <w:rPr>
+          <w:rFonts w:ascii="Consolas" w:eastAsia="Consolas" w:hAnsi="Consolas" w:cs="Consolas"/>
+          <w:sz w:val="17"/>
+          <w:szCs w:val="17"/>
+        </w:rPr>
+        <w:t>Here's the brief and rubric for &lt;UNIT&gt; &lt;assessment&gt;: &lt;paste&gt;. Help me with this assignment. Start by checking what my AI-use policy allows.</w:t>
+      </w:r>
+    </w:p>
+    <w:p>
+      <w:pPr>
+        <w:pStyle w:val="Heading2"/>
+      </w:pPr>
+      <w:r>
+        <w:t>6. Build something</w:t>
+      </w:r>
+    </w:p>
+    <w:p>
+      <w:pPr>
+        <w:pBdr>
+          <w:top w:val="single" w:sz="12" w:space="4" w:color="4F46E5"/>
+          <w:left w:val="single" w:sz="12" w:space="4" w:color="4F46E5"/>
+          <w:bottom w:val="single" w:sz="12" w:space="4" w:color="4F46E5"/>
+          <w:right w:val="single" w:sz="12" w:space="4" w:color="4F46E5"/>
+        </w:pBdr>
+        <w:shd w:val="clear" w:color="auto" w:fill="F5F3FF"/>
+        <w:spacing w:before="120" w:after="200" w:line="250" w:lineRule="auto"/>
+        <w:ind w:left="120" w:right="120"/>
+      </w:pPr>
+      <w:r>
+        <w:rPr>
+          <w:rFonts w:ascii="Consolas" w:eastAsia="Consolas" w:hAnsi="Consolas" w:cs="Consolas"/>
+          <w:sz w:val="17"/>
+          <w:szCs w:val="17"/>
+        </w:rPr>
+        <w:t>Build me &lt;a tool/agent that does X&gt;. Spec it with me first, keep version 1 tiny, and show me it working before you call it done.</w:t>
+      </w:r>
+    </w:p>
+    <w:p>
+      <w:pPr>
+        <w:pStyle w:val="Heading2"/>
+      </w:pPr>
+      <w:r>
+        <w:t>7. Something is broken</w:t>
+      </w:r>
+    </w:p>
+    <w:p>
+      <w:pPr>
+        <w:pBdr>
+          <w:top w:val="single" w:sz="12" w:space="4" w:color="4F46E5"/>
+          <w:left w:val="single" w:sz="12" w:space="4" w:color="4F46E5"/>
+          <w:bottom w:val="single" w:sz="12" w:space="4" w:color="4F46E5"/>
+          <w:right w:val="single" w:sz="12" w:space="4" w:color="4F46E5"/>
+        </w:pBdr>
+        <w:shd w:val="clear" w:color="auto" w:fill="F5F3FF"/>
+        <w:spacing w:before="120" w:after="200" w:line="250" w:lineRule="auto"/>
+        <w:ind w:left="120" w:right="120"/>
+      </w:pPr>
+      <w:r>
+        <w:rPr>
+          <w:rFonts w:ascii="Consolas" w:eastAsia="Consolas" w:hAnsi="Consolas" w:cs="Consolas"/>
+          <w:sz w:val="17"/>
+          <w:szCs w:val="17"/>
+        </w:rPr>
+        <w:t>Here's the full error: &lt;paste&gt;. Debug this. Don't change anything until you've told me the cause in plain English.</w:t>
+      </w:r>
+    </w:p>
+    <w:p>
+      <w:pPr>
+        <w:pStyle w:val="Heading2"/>
+      </w:pPr>
+      <w:r>
+        <w:t>8. End of the day</w:t>
+      </w:r>
+    </w:p>
+    <w:p>
+      <w:pPr>
+        <w:pBdr>
+          <w:top w:val="single" w:sz="12" w:space="4" w:color="4F46E5"/>
+          <w:left w:val="single" w:sz="12" w:space="4" w:color="4F46E5"/>
+          <w:bottom w:val="single" w:sz="12" w:space="4" w:color="4F46E5"/>
+          <w:right w:val="single" w:sz="12" w:space="4" w:color="4F46E5"/>
+        </w:pBdr>
+        <w:shd w:val="clear" w:color="auto" w:fill="F5F3FF"/>
+        <w:spacing w:before="120" w:after="200" w:line="250" w:lineRule="auto"/>
+        <w:ind w:left="120" w:right="120"/>
+      </w:pPr>
+      <w:r>
+        <w:rPr>
+          <w:rFonts w:ascii="Consolas" w:eastAsia="Consolas" w:hAnsi="Consolas" w:cs="Consolas"/>
+          <w:sz w:val="17"/>
+          <w:szCs w:val="17"/>
+        </w:rPr>
+        <w:t>wrap up</w:t>
       </w:r>
     </w:p>
     <w:sectPr>
@@ -21244,10 +22075,10 @@
 <file path=word/numbering.xml><?xml version="1.0" encoding="utf-8"?>
 <w:numbering xmlns:wpc="http://schemas.microsoft.com/office/word/2010/wordprocessingCanvas" xmlns:cx="http://schemas.microsoft.com/office/drawing/2014/chartex" xmlns:cx1="http://schemas.microsoft.com/office/drawing/2015/9/8/chartex" xmlns:cx2="http://schemas.microsoft.com/office/drawing/2015/10/21/chartex" xmlns:cx3="http://schemas.microsoft.com/office/drawing/2016/5/9/chartex" xmlns:cx4="http://schemas.microsoft.com/office/drawing/2016/5/10/chartex" xmlns:cx5="http://schemas.microsoft.com/office/drawing/2016/5/11/chartex" xmlns:cx6="http://schemas.microsoft.com/office/drawing/2016/5/12/chartex" xmlns:cx7="http://schemas.microsoft.com/office/drawing/2016/5/13/chartex" xmlns:cx8="http://schemas.microsoft.com/office/drawing/2016/5/14/chartex" xmlns:mc="http://schemas.openxmlformats.org/markup-compatibility/2006" xmlns:m="http://schemas.openxmlformats.org/officeDocument/2006/math" xmlns:aink="http://schemas.microsoft.com/office/drawing/2016/ink" xmlns:am3d="http://schemas.microsoft.com/office/drawing/2017/model3d" xmlns:oel="http://schemas.microsoft.com/office/2019/extlst" xmlns:r="http://schemas.openxmlformats.org/officeDocument/2006/relationships" xmlns:wp14="http://schemas.microsoft.com/office/word/2010/wordprocessingDrawing" xmlns:wp="http://schemas.openxmlformats.org/drawingml/2006/wordprocessingDrawing" xmlns:wpg="http://schemas.microsoft.com/office/word/2010/wordprocessingGroup" xmlns:wpi="http://schemas.microsoft.com/office/word/2010/wordprocessingInk" xmlns:wps="http://schemas.microsoft.com/office/word/2010/wordprocessingShape" xmlns:o="urn:schemas-microsoft-com:office:office" xmlns:v="urn:schemas-microsoft-com:vml" xmlns:w10="urn:schemas-microsoft-com:office:word" xmlns:w="http://schemas.openxmlformats.org/wordprocessingml/2006/main" xmlns:w14="http://schemas.microsoft.com/office/word/2010/wordml" xmlns:w15="http://schemas.microsoft.com/office/word/2012/wordml" xmlns:w16cex="http://schemas.microsoft.com/office/word/2018/wordml/cex" xmlns:w16cid="http://schemas.microsoft.com/office/word/2016/wordml/cid" xmlns:w16="http://schemas.microsoft.com/office/word/2018/wordml" xmlns:w16sdtdh="http://schemas.microsoft.com/office/word/2020/wordml/sdtdatahash" xmlns:w16sdtfl="http://schemas.microsoft.com/office/word/2024/wordml/sdtformatlock" xmlns:w16se="http://schemas.microsoft.com/office/word/2015/wordml/symex" xmlns:w16du="http://schemas.microsoft.com/office/word/2023/wordml/word16du" xmlns:wne="http://schemas.microsoft.com/office/word/2006/wordml" mc:Ignorable="w14 w15 w16se w16cid w16 w16cex w16sdtdh w16sdtfl w16du wp14">
   <w:abstractNum w:abstractNumId="0" w15:restartNumberingAfterBreak="0">
-    <w:nsid w:val="2DF13130"/>
+    <w:nsid w:val="12CF3650"/>
     <w:multiLevelType w:val="hybridMultilevel"/>
-    <w:tmpl w:val="95E610F8"/>
-    <w:lvl w:ilvl="0" w:tplc="5BCC2498">
+    <w:tmpl w:val="B1664D48"/>
+    <w:lvl w:ilvl="0" w:tplc="3C0AD6E0">
       <w:start w:val="1"/>
       <w:numFmt w:val="decimal"/>
       <w:lvlText w:val="%1."/>
@@ -21256,52 +22087,52 @@
         <w:ind w:left="540" w:hanging="360"/>
       </w:pPr>
     </w:lvl>
-    <w:lvl w:ilvl="1" w:tplc="51EE77D0">
+    <w:lvl w:ilvl="1" w:tplc="0CD82406">
       <w:numFmt w:val="decimal"/>
       <w:lvlText w:val=""/>
       <w:lvlJc w:val="left"/>
     </w:lvl>
-    <w:lvl w:ilvl="2" w:tplc="F744962E">
+    <w:lvl w:ilvl="2" w:tplc="6A8CE496">
       <w:numFmt w:val="decimal"/>
       <w:lvlText w:val=""/>
       <w:lvlJc w:val="left"/>
     </w:lvl>
-    <w:lvl w:ilvl="3" w:tplc="DC1A7E4A">
+    <w:lvl w:ilvl="3" w:tplc="EFDEA812">
       <w:numFmt w:val="decimal"/>
       <w:lvlText w:val=""/>
       <w:lvlJc w:val="left"/>
     </w:lvl>
-    <w:lvl w:ilvl="4" w:tplc="5B66EAAC">
+    <w:lvl w:ilvl="4" w:tplc="424A83F0">
       <w:numFmt w:val="decimal"/>
       <w:lvlText w:val=""/>
       <w:lvlJc w:val="left"/>
     </w:lvl>
-    <w:lvl w:ilvl="5" w:tplc="4DAE8CE0">
+    <w:lvl w:ilvl="5" w:tplc="F36E7C64">
       <w:numFmt w:val="decimal"/>
       <w:lvlText w:val=""/>
       <w:lvlJc w:val="left"/>
     </w:lvl>
-    <w:lvl w:ilvl="6" w:tplc="136C5B50">
+    <w:lvl w:ilvl="6" w:tplc="65002B4A">
       <w:numFmt w:val="decimal"/>
       <w:lvlText w:val=""/>
       <w:lvlJc w:val="left"/>
     </w:lvl>
-    <w:lvl w:ilvl="7" w:tplc="97A0417C">
+    <w:lvl w:ilvl="7" w:tplc="3F9A82F0">
       <w:numFmt w:val="decimal"/>
       <w:lvlText w:val=""/>
       <w:lvlJc w:val="left"/>
     </w:lvl>
-    <w:lvl w:ilvl="8" w:tplc="BCE06D2E">
+    <w:lvl w:ilvl="8" w:tplc="CF10337A">
       <w:numFmt w:val="decimal"/>
       <w:lvlText w:val=""/>
       <w:lvlJc w:val="left"/>
     </w:lvl>
   </w:abstractNum>
   <w:abstractNum w:abstractNumId="1" w15:restartNumberingAfterBreak="0">
-    <w:nsid w:val="362E49F9"/>
+    <w:nsid w:val="346A7C23"/>
     <w:multiLevelType w:val="hybridMultilevel"/>
-    <w:tmpl w:val="2D3A801A"/>
-    <w:lvl w:ilvl="0" w:tplc="0BF64D1A">
+    <w:tmpl w:val="4828B3DE"/>
+    <w:lvl w:ilvl="0" w:tplc="DDA838A4">
       <w:start w:val="1"/>
       <w:numFmt w:val="decimal"/>
       <w:lvlText w:val="%1."/>
@@ -21310,267 +22141,327 @@
         <w:ind w:left="540" w:hanging="360"/>
       </w:pPr>
     </w:lvl>
-    <w:lvl w:ilvl="1" w:tplc="66CE42F8">
+    <w:lvl w:ilvl="1" w:tplc="7F20704E">
       <w:numFmt w:val="decimal"/>
       <w:lvlText w:val=""/>
       <w:lvlJc w:val="left"/>
     </w:lvl>
-    <w:lvl w:ilvl="2" w:tplc="94B2DDB0">
+    <w:lvl w:ilvl="2" w:tplc="F8D4990A">
       <w:numFmt w:val="decimal"/>
       <w:lvlText w:val=""/>
       <w:lvlJc w:val="left"/>
     </w:lvl>
-    <w:lvl w:ilvl="3" w:tplc="653E5F68">
+    <w:lvl w:ilvl="3" w:tplc="A41E930E">
       <w:numFmt w:val="decimal"/>
       <w:lvlText w:val=""/>
       <w:lvlJc w:val="left"/>
     </w:lvl>
-    <w:lvl w:ilvl="4" w:tplc="8D0CA576">
+    <w:lvl w:ilvl="4" w:tplc="1C902E0C">
       <w:numFmt w:val="decimal"/>
       <w:lvlText w:val=""/>
       <w:lvlJc w:val="left"/>
     </w:lvl>
-    <w:lvl w:ilvl="5" w:tplc="515EF546">
+    <w:lvl w:ilvl="5" w:tplc="121E7180">
       <w:numFmt w:val="decimal"/>
       <w:lvlText w:val=""/>
       <w:lvlJc w:val="left"/>
     </w:lvl>
-    <w:lvl w:ilvl="6" w:tplc="046E7246">
+    <w:lvl w:ilvl="6" w:tplc="BAD4C72C">
       <w:numFmt w:val="decimal"/>
       <w:lvlText w:val=""/>
       <w:lvlJc w:val="left"/>
     </w:lvl>
-    <w:lvl w:ilvl="7" w:tplc="588C71E8">
+    <w:lvl w:ilvl="7" w:tplc="7D06C7E6">
       <w:numFmt w:val="decimal"/>
       <w:lvlText w:val=""/>
       <w:lvlJc w:val="left"/>
     </w:lvl>
-    <w:lvl w:ilvl="8" w:tplc="68AABF4A">
+    <w:lvl w:ilvl="8" w:tplc="79B2396C">
       <w:numFmt w:val="decimal"/>
       <w:lvlText w:val=""/>
       <w:lvlJc w:val="left"/>
     </w:lvl>
   </w:abstractNum>
   <w:abstractNum w:abstractNumId="2" w15:restartNumberingAfterBreak="0">
-    <w:nsid w:val="3A103B4E"/>
+    <w:nsid w:val="3D3848E7"/>
     <w:multiLevelType w:val="hybridMultilevel"/>
-    <w:tmpl w:val="E3CC9FEE"/>
-    <w:lvl w:ilvl="0" w:tplc="E2488DB4">
+    <w:tmpl w:val="0DC82506"/>
+    <w:lvl w:ilvl="0" w:tplc="DBB06F5A">
       <w:start w:val="1"/>
-      <w:numFmt w:val="decimal"/>
-      <w:lvlText w:val="%1."/>
+      <w:numFmt w:val="bullet"/>
+      <w:lvlText w:val="•"/>
       <w:lvlJc w:val="left"/>
       <w:pPr>
-        <w:ind w:left="540" w:hanging="360"/>
+        <w:ind w:left="540" w:hanging="300"/>
       </w:pPr>
     </w:lvl>
-    <w:lvl w:ilvl="1" w:tplc="B352C216">
+    <w:lvl w:ilvl="1" w:tplc="6D861C52">
       <w:numFmt w:val="decimal"/>
       <w:lvlText w:val=""/>
       <w:lvlJc w:val="left"/>
     </w:lvl>
-    <w:lvl w:ilvl="2" w:tplc="7E5AE758">
+    <w:lvl w:ilvl="2" w:tplc="D62AB318">
       <w:numFmt w:val="decimal"/>
       <w:lvlText w:val=""/>
       <w:lvlJc w:val="left"/>
     </w:lvl>
-    <w:lvl w:ilvl="3" w:tplc="B91A8EFA">
+    <w:lvl w:ilvl="3" w:tplc="544C43EC">
       <w:numFmt w:val="decimal"/>
       <w:lvlText w:val=""/>
       <w:lvlJc w:val="left"/>
     </w:lvl>
-    <w:lvl w:ilvl="4" w:tplc="AAE0CA5A">
+    <w:lvl w:ilvl="4" w:tplc="06D8EA0C">
       <w:numFmt w:val="decimal"/>
       <w:lvlText w:val=""/>
       <w:lvlJc w:val="left"/>
     </w:lvl>
-    <w:lvl w:ilvl="5" w:tplc="960A705E">
+    <w:lvl w:ilvl="5" w:tplc="79F4ECDE">
       <w:numFmt w:val="decimal"/>
       <w:lvlText w:val=""/>
       <w:lvlJc w:val="left"/>
     </w:lvl>
-    <w:lvl w:ilvl="6" w:tplc="21540938">
+    <w:lvl w:ilvl="6" w:tplc="AAEED78C">
       <w:numFmt w:val="decimal"/>
       <w:lvlText w:val=""/>
       <w:lvlJc w:val="left"/>
     </w:lvl>
-    <w:lvl w:ilvl="7" w:tplc="17B49F28">
+    <w:lvl w:ilvl="7" w:tplc="C0889422">
       <w:numFmt w:val="decimal"/>
       <w:lvlText w:val=""/>
       <w:lvlJc w:val="left"/>
     </w:lvl>
-    <w:lvl w:ilvl="8" w:tplc="4E600DF6">
+    <w:lvl w:ilvl="8" w:tplc="4FAA9D54">
       <w:numFmt w:val="decimal"/>
       <w:lvlText w:val=""/>
       <w:lvlJc w:val="left"/>
     </w:lvl>
   </w:abstractNum>
   <w:abstractNum w:abstractNumId="3" w15:restartNumberingAfterBreak="0">
-    <w:nsid w:val="3C735165"/>
+    <w:nsid w:val="434F6E9A"/>
     <w:multiLevelType w:val="hybridMultilevel"/>
-    <w:tmpl w:val="A2366E6C"/>
-    <w:lvl w:ilvl="0" w:tplc="96944D14" w:tentative="1">
+    <w:tmpl w:val="CB5E493A"/>
+    <w:lvl w:ilvl="0" w:tplc="87E03F50">
       <w:start w:val="1"/>
-      <w:numFmt w:val="bullet"/>
-      <w:lvlText w:val="●"/>
+      <w:numFmt w:val="decimal"/>
+      <w:lvlText w:val="%1."/>
       <w:lvlJc w:val="left"/>
       <w:pPr>
-        <w:ind w:left="720" w:hanging="360"/>
+        <w:ind w:left="540" w:hanging="360"/>
       </w:pPr>
     </w:lvl>
-    <w:lvl w:ilvl="1" w:tplc="5314AF14" w:tentative="1">
-      <w:start w:val="1"/>
-      <w:numFmt w:val="bullet"/>
-      <w:lvlText w:val="○"/>
-      <w:lvlJc w:val="left"/>
-      <w:pPr>
-        <w:ind w:left="1440" w:hanging="360"/>
-      </w:pPr>
-    </w:lvl>
-    <w:lvl w:ilvl="2" w:tplc="3F4A65B2" w:tentative="1">
-      <w:start w:val="1"/>
-      <w:numFmt w:val="bullet"/>
-      <w:lvlText w:val="■"/>
-      <w:lvlJc w:val="left"/>
-      <w:pPr>
-        <w:ind w:left="2160" w:hanging="360"/>
-      </w:pPr>
-    </w:lvl>
-    <w:lvl w:ilvl="3" w:tplc="F7C8718C" w:tentative="1">
-      <w:start w:val="1"/>
-      <w:numFmt w:val="bullet"/>
-      <w:lvlText w:val="●"/>
-      <w:lvlJc w:val="left"/>
-      <w:pPr>
-        <w:ind w:left="2880" w:hanging="360"/>
-      </w:pPr>
-    </w:lvl>
-    <w:lvl w:ilvl="4" w:tplc="939440CC" w:tentative="1">
-      <w:start w:val="1"/>
-      <w:numFmt w:val="bullet"/>
-      <w:lvlText w:val="○"/>
-      <w:lvlJc w:val="left"/>
-      <w:pPr>
-        <w:ind w:left="3600" w:hanging="360"/>
-      </w:pPr>
-    </w:lvl>
-    <w:lvl w:ilvl="5" w:tplc="1D7C6FC2" w:tentative="1">
-      <w:start w:val="1"/>
-      <w:numFmt w:val="bullet"/>
-      <w:lvlText w:val="■"/>
-      <w:lvlJc w:val="left"/>
-      <w:pPr>
-        <w:ind w:left="4320" w:hanging="360"/>
-      </w:pPr>
-    </w:lvl>
-    <w:lvl w:ilvl="6" w:tplc="03A40576" w:tentative="1">
-      <w:start w:val="1"/>
-      <w:numFmt w:val="bullet"/>
-      <w:lvlText w:val="●"/>
-      <w:lvlJc w:val="left"/>
-      <w:pPr>
-        <w:ind w:left="5040" w:hanging="360"/>
-      </w:pPr>
-    </w:lvl>
-    <w:lvl w:ilvl="7" w:tplc="DE74A520" w:tentative="1">
-      <w:start w:val="1"/>
-      <w:numFmt w:val="bullet"/>
-      <w:lvlText w:val="●"/>
-      <w:lvlJc w:val="left"/>
-      <w:pPr>
-        <w:ind w:left="5760" w:hanging="360"/>
-      </w:pPr>
-    </w:lvl>
-    <w:lvl w:ilvl="8" w:tplc="41C81A36" w:tentative="1">
-      <w:start w:val="1"/>
-      <w:numFmt w:val="bullet"/>
-      <w:lvlText w:val="●"/>
-      <w:lvlJc w:val="left"/>
-      <w:pPr>
-        <w:ind w:left="6480" w:hanging="360"/>
-      </w:pPr>
-    </w:lvl>
-  </w:abstractNum>
-  <w:abstractNum w:abstractNumId="4" w15:restartNumberingAfterBreak="0">
-    <w:nsid w:val="5AE301F0"/>
-    <w:multiLevelType w:val="hybridMultilevel"/>
-    <w:tmpl w:val="1A404F18"/>
-    <w:lvl w:ilvl="0" w:tplc="DB76BB5A">
-      <w:start w:val="1"/>
-      <w:numFmt w:val="bullet"/>
-      <w:lvlText w:val="•"/>
-      <w:lvlJc w:val="left"/>
-      <w:pPr>
-        <w:ind w:left="540" w:hanging="300"/>
-      </w:pPr>
-    </w:lvl>
-    <w:lvl w:ilvl="1" w:tplc="1138F75E">
+    <w:lvl w:ilvl="1" w:tplc="6F28E910">
       <w:numFmt w:val="decimal"/>
       <w:lvlText w:val=""/>
       <w:lvlJc w:val="left"/>
     </w:lvl>
-    <w:lvl w:ilvl="2" w:tplc="8506D8EC">
+    <w:lvl w:ilvl="2" w:tplc="C5E43D68">
       <w:numFmt w:val="decimal"/>
       <w:lvlText w:val=""/>
       <w:lvlJc w:val="left"/>
     </w:lvl>
-    <w:lvl w:ilvl="3" w:tplc="76B45602">
+    <w:lvl w:ilvl="3" w:tplc="24BA5F0C">
       <w:numFmt w:val="decimal"/>
       <w:lvlText w:val=""/>
       <w:lvlJc w:val="left"/>
     </w:lvl>
-    <w:lvl w:ilvl="4" w:tplc="1E286D16">
+    <w:lvl w:ilvl="4" w:tplc="D560720A">
       <w:numFmt w:val="decimal"/>
       <w:lvlText w:val=""/>
       <w:lvlJc w:val="left"/>
     </w:lvl>
-    <w:lvl w:ilvl="5" w:tplc="5F98C6B0">
+    <w:lvl w:ilvl="5" w:tplc="72A6D8BE">
       <w:numFmt w:val="decimal"/>
       <w:lvlText w:val=""/>
       <w:lvlJc w:val="left"/>
     </w:lvl>
-    <w:lvl w:ilvl="6" w:tplc="DA906604">
+    <w:lvl w:ilvl="6" w:tplc="AE520208">
       <w:numFmt w:val="decimal"/>
       <w:lvlText w:val=""/>
       <w:lvlJc w:val="left"/>
     </w:lvl>
-    <w:lvl w:ilvl="7" w:tplc="3AB22D78">
+    <w:lvl w:ilvl="7" w:tplc="43B252DC">
       <w:numFmt w:val="decimal"/>
       <w:lvlText w:val=""/>
       <w:lvlJc w:val="left"/>
     </w:lvl>
-    <w:lvl w:ilvl="8" w:tplc="D9064D7A">
+    <w:lvl w:ilvl="8" w:tplc="4D18F59E">
       <w:numFmt w:val="decimal"/>
       <w:lvlText w:val=""/>
       <w:lvlJc w:val="left"/>
     </w:lvl>
   </w:abstractNum>
-  <w:num w:numId="1" w16cid:durableId="654261270">
+  <w:abstractNum w:abstractNumId="4" w15:restartNumberingAfterBreak="0">
+    <w:nsid w:val="5664729E"/>
+    <w:multiLevelType w:val="hybridMultilevel"/>
+    <w:tmpl w:val="CD3AB1F2"/>
+    <w:lvl w:ilvl="0" w:tplc="06DA43C2">
+      <w:start w:val="1"/>
+      <w:numFmt w:val="decimal"/>
+      <w:lvlText w:val="%1."/>
+      <w:lvlJc w:val="left"/>
+      <w:pPr>
+        <w:ind w:left="540" w:hanging="360"/>
+      </w:pPr>
+    </w:lvl>
+    <w:lvl w:ilvl="1" w:tplc="C21897AA">
+      <w:numFmt w:val="decimal"/>
+      <w:lvlText w:val=""/>
+      <w:lvlJc w:val="left"/>
+    </w:lvl>
+    <w:lvl w:ilvl="2" w:tplc="EC0AF2C2">
+      <w:numFmt w:val="decimal"/>
+      <w:lvlText w:val=""/>
+      <w:lvlJc w:val="left"/>
+    </w:lvl>
+    <w:lvl w:ilvl="3" w:tplc="B36CEB10">
+      <w:numFmt w:val="decimal"/>
+      <w:lvlText w:val=""/>
+      <w:lvlJc w:val="left"/>
+    </w:lvl>
+    <w:lvl w:ilvl="4" w:tplc="8C7CDE3C">
+      <w:numFmt w:val="decimal"/>
+      <w:lvlText w:val=""/>
+      <w:lvlJc w:val="left"/>
+    </w:lvl>
+    <w:lvl w:ilvl="5" w:tplc="3BEE95B8">
+      <w:numFmt w:val="decimal"/>
+      <w:lvlText w:val=""/>
+      <w:lvlJc w:val="left"/>
+    </w:lvl>
+    <w:lvl w:ilvl="6" w:tplc="531260F6">
+      <w:numFmt w:val="decimal"/>
+      <w:lvlText w:val=""/>
+      <w:lvlJc w:val="left"/>
+    </w:lvl>
+    <w:lvl w:ilvl="7" w:tplc="26864534">
+      <w:numFmt w:val="decimal"/>
+      <w:lvlText w:val=""/>
+      <w:lvlJc w:val="left"/>
+    </w:lvl>
+    <w:lvl w:ilvl="8" w:tplc="53E61776">
+      <w:numFmt w:val="decimal"/>
+      <w:lvlText w:val=""/>
+      <w:lvlJc w:val="left"/>
+    </w:lvl>
+  </w:abstractNum>
+  <w:abstractNum w:abstractNumId="5" w15:restartNumberingAfterBreak="0">
+    <w:nsid w:val="7E5F4641"/>
+    <w:multiLevelType w:val="hybridMultilevel"/>
+    <w:tmpl w:val="E228B8FC"/>
+    <w:lvl w:ilvl="0" w:tplc="13E0C37A" w:tentative="1">
+      <w:start w:val="1"/>
+      <w:numFmt w:val="bullet"/>
+      <w:lvlText w:val="●"/>
+      <w:lvlJc w:val="left"/>
+      <w:pPr>
+        <w:ind w:left="720" w:hanging="360"/>
+      </w:pPr>
+    </w:lvl>
+    <w:lvl w:ilvl="1" w:tplc="ABF68438" w:tentative="1">
+      <w:start w:val="1"/>
+      <w:numFmt w:val="bullet"/>
+      <w:lvlText w:val="○"/>
+      <w:lvlJc w:val="left"/>
+      <w:pPr>
+        <w:ind w:left="1440" w:hanging="360"/>
+      </w:pPr>
+    </w:lvl>
+    <w:lvl w:ilvl="2" w:tplc="D54C8704" w:tentative="1">
+      <w:start w:val="1"/>
+      <w:numFmt w:val="bullet"/>
+      <w:lvlText w:val="■"/>
+      <w:lvlJc w:val="left"/>
+      <w:pPr>
+        <w:ind w:left="2160" w:hanging="360"/>
+      </w:pPr>
+    </w:lvl>
+    <w:lvl w:ilvl="3" w:tplc="332A4928" w:tentative="1">
+      <w:start w:val="1"/>
+      <w:numFmt w:val="bullet"/>
+      <w:lvlText w:val="●"/>
+      <w:lvlJc w:val="left"/>
+      <w:pPr>
+        <w:ind w:left="2880" w:hanging="360"/>
+      </w:pPr>
+    </w:lvl>
+    <w:lvl w:ilvl="4" w:tplc="D9901B42" w:tentative="1">
+      <w:start w:val="1"/>
+      <w:numFmt w:val="bullet"/>
+      <w:lvlText w:val="○"/>
+      <w:lvlJc w:val="left"/>
+      <w:pPr>
+        <w:ind w:left="3600" w:hanging="360"/>
+      </w:pPr>
+    </w:lvl>
+    <w:lvl w:ilvl="5" w:tplc="30BCF0F0" w:tentative="1">
+      <w:start w:val="1"/>
+      <w:numFmt w:val="bullet"/>
+      <w:lvlText w:val="■"/>
+      <w:lvlJc w:val="left"/>
+      <w:pPr>
+        <w:ind w:left="4320" w:hanging="360"/>
+      </w:pPr>
+    </w:lvl>
+    <w:lvl w:ilvl="6" w:tplc="B16C2000" w:tentative="1">
+      <w:start w:val="1"/>
+      <w:numFmt w:val="bullet"/>
+      <w:lvlText w:val="●"/>
+      <w:lvlJc w:val="left"/>
+      <w:pPr>
+        <w:ind w:left="5040" w:hanging="360"/>
+      </w:pPr>
+    </w:lvl>
+    <w:lvl w:ilvl="7" w:tplc="082AB17E" w:tentative="1">
+      <w:start w:val="1"/>
+      <w:numFmt w:val="bullet"/>
+      <w:lvlText w:val="●"/>
+      <w:lvlJc w:val="left"/>
+      <w:pPr>
+        <w:ind w:left="5760" w:hanging="360"/>
+      </w:pPr>
+    </w:lvl>
+    <w:lvl w:ilvl="8" w:tplc="E64CA16E" w:tentative="1">
+      <w:start w:val="1"/>
+      <w:numFmt w:val="bullet"/>
+      <w:lvlText w:val="●"/>
+      <w:lvlJc w:val="left"/>
+      <w:pPr>
+        <w:ind w:left="6480" w:hanging="360"/>
+      </w:pPr>
+    </w:lvl>
+  </w:abstractNum>
+  <w:num w:numId="1" w16cid:durableId="2135248622">
+    <w:abstractNumId w:val="5"/>
+    <w:lvlOverride w:ilvl="0">
+      <w:startOverride w:val="1"/>
+    </w:lvlOverride>
+  </w:num>
+  <w:num w:numId="2" w16cid:durableId="1889880201">
+    <w:abstractNumId w:val="2"/>
+    <w:lvlOverride w:ilvl="0">
+      <w:startOverride w:val="1"/>
+    </w:lvlOverride>
+  </w:num>
+  <w:num w:numId="3" w16cid:durableId="1186214751">
+    <w:abstractNumId w:val="0"/>
+    <w:lvlOverride w:ilvl="0">
+      <w:startOverride w:val="1"/>
+    </w:lvlOverride>
+  </w:num>
+  <w:num w:numId="4" w16cid:durableId="1101030252">
+    <w:abstractNumId w:val="4"/>
+    <w:lvlOverride w:ilvl="0">
+      <w:startOverride w:val="1"/>
+    </w:lvlOverride>
+  </w:num>
+  <w:num w:numId="5" w16cid:durableId="529222536">
     <w:abstractNumId w:val="3"/>
     <w:lvlOverride w:ilvl="0">
       <w:startOverride w:val="1"/>
     </w:lvlOverride>
   </w:num>
-  <w:num w:numId="2" w16cid:durableId="559633547">
-    <w:abstractNumId w:val="4"/>
-    <w:lvlOverride w:ilvl="0">
-      <w:startOverride w:val="1"/>
-    </w:lvlOverride>
-  </w:num>
-  <w:num w:numId="3" w16cid:durableId="906232161">
-    <w:abstractNumId w:val="0"/>
-    <w:lvlOverride w:ilvl="0">
-      <w:startOverride w:val="1"/>
-    </w:lvlOverride>
-  </w:num>
-  <w:num w:numId="4" w16cid:durableId="653876547">
+  <w:num w:numId="6" w16cid:durableId="1166439872">
     <w:abstractNumId w:val="1"/>
-    <w:lvlOverride w:ilvl="0">
-      <w:startOverride w:val="1"/>
-    </w:lvlOverride>
-  </w:num>
-  <w:num w:numId="5" w16cid:durableId="2012102740">
-    <w:abstractNumId w:val="2"/>
     <w:lvlOverride w:ilvl="0">
       <w:startOverride w:val="1"/>
     </w:lvlOverride>
@@ -22003,6 +22894,8 @@
     <w:unhideWhenUsed/>
     <w:qFormat/>
     <w:pPr>
+      <w:keepNext/>
+      <w:keepLines/>
       <w:spacing w:before="300" w:after="120"/>
       <w:outlineLvl w:val="1"/>
     </w:pPr>
@@ -22023,6 +22916,8 @@
     <w:unhideWhenUsed/>
     <w:qFormat/>
     <w:pPr>
+      <w:keepNext/>
+      <w:keepLines/>
       <w:spacing w:before="200" w:after="80"/>
       <w:outlineLvl w:val="2"/>
     </w:pPr>
@@ -22213,7 +23108,7 @@
     <w:autoRedefine/>
     <w:uiPriority w:val="39"/>
     <w:unhideWhenUsed/>
-    <w:rsid w:val="00794A77"/>
+    <w:rsid w:val="00524FA1"/>
     <w:pPr>
       <w:spacing w:after="100"/>
     </w:pPr>

</xml_diff>